<commit_message>
v45: JobHunt description enrichie (crons, matching, 83 tests, BDD, CI/CD) + Emotional Intelligence in Leadership cert + retrait SQL form FR
</commit_message>
<xml_diff>
--- a/cv_tasin_jahangir.docx
+++ b/cv_tasin_jahangir.docx
@@ -3,947 +3,1819 @@
 <w:document xmlns:wpc="http://schemas.microsoft.com/office/word/2010/wordprocessingCanvas" xmlns:mo="http://schemas.microsoft.com/office/mac/office/2008/main" xmlns:mc="http://schemas.openxmlformats.org/markup-compatibility/2006" xmlns:mv="urn:schemas-microsoft-com:mac:vml" xmlns:o="urn:schemas-microsoft-com:office:office" xmlns:r="http://schemas.openxmlformats.org/officeDocument/2006/relationships" xmlns:m="http://schemas.openxmlformats.org/officeDocument/2006/math" xmlns:v="urn:schemas-microsoft-com:vml" xmlns:wp14="http://schemas.microsoft.com/office/word/2010/wordprocessingDrawing" xmlns:wp="http://schemas.openxmlformats.org/drawingml/2006/wordprocessingDrawing" xmlns:w10="urn:schemas-microsoft-com:office:word" xmlns:w="http://schemas.openxmlformats.org/wordprocessingml/2006/main" xmlns:w14="http://schemas.microsoft.com/office/word/2010/wordml" xmlns:wpg="http://schemas.microsoft.com/office/word/2010/wordprocessingGroup" xmlns:wpi="http://schemas.microsoft.com/office/word/2010/wordprocessingInk" xmlns:wne="http://schemas.microsoft.com/office/word/2006/wordml" xmlns:wps="http://schemas.microsoft.com/office/word/2010/wordprocessingShape" mc:Ignorable="w14 wp14">
   <w:body>
     <w:p>
-      <w:r>
-        <w:rPr>
-          <w:b w:val="0"/>
-          <w:color w:val="111111"/>
-          <w:sz w:val="44"/>
-        </w:rPr>
-        <w:t>Thasin Jahangir</w:t>
+      <w:pPr>
+        <w:pStyle w:val="Title"/>
+      </w:pPr>
+      <w:r>
+        <w:t>Thasin Jahangir - CV</w:t>
       </w:r>
     </w:p>
     <w:p>
       <w:r>
         <w:rPr>
           <w:b/>
-          <w:color w:val="1A4A9E"/>
-          <w:sz w:val="26"/>
         </w:rPr>
         <w:t>Consultant QA Senior · Freelance SASU</w:t>
       </w:r>
-    </w:p>
-    <w:p>
-      <w:r>
-        <w:rPr>
-          <w:b w:val="0"/>
-          <w:color w:val="666666"/>
-          <w:sz w:val="18"/>
-        </w:rPr>
-        <w:t>Paris &amp; Remote</w:t>
-      </w:r>
-      <w:r>
-        <w:rPr>
-          <w:b w:val="0"/>
-          <w:color w:val="666666"/>
-          <w:sz w:val="18"/>
-        </w:rPr>
-        <w:t xml:space="preserve"> · </w:t>
-      </w:r>
-      <w:r>
-        <w:rPr>
-          <w:b w:val="0"/>
-          <w:color w:val="666666"/>
-          <w:sz w:val="18"/>
-        </w:rPr>
-        <w:t>07 69 78 72 13</w:t>
-      </w:r>
-      <w:r>
-        <w:rPr>
-          <w:b w:val="0"/>
-          <w:color w:val="666666"/>
-          <w:sz w:val="18"/>
-        </w:rPr>
-        <w:t xml:space="preserve"> · </w:t>
-      </w:r>
-      <w:r>
-        <w:rPr>
-          <w:b w:val="0"/>
-          <w:color w:val="666666"/>
-          <w:sz w:val="18"/>
-        </w:rPr>
-        <w:t>thasin@live.com</w:t>
-      </w:r>
-      <w:r>
-        <w:rPr>
-          <w:b w:val="0"/>
-          <w:color w:val="666666"/>
-          <w:sz w:val="18"/>
-        </w:rPr>
-        <w:t xml:space="preserve"> · </w:t>
-      </w:r>
-      <w:r>
-        <w:rPr>
-          <w:b w:val="0"/>
-          <w:color w:val="666666"/>
-          <w:sz w:val="18"/>
-        </w:rPr>
-        <w:t>linkedin.com/in/thasin-j-47582635</w:t>
+      <w:r>
+        <w:br/>
+        <w:t>Paris &amp; Remote · 07 69 78 72 13 · thasin@live.com</w:t>
+      </w:r>
+    </w:p>
+    <w:p>
+      <w:r>
+        <w:br w:type="page"/>
       </w:r>
     </w:p>
     <w:p>
       <w:pPr>
-        <w:spacing w:before="160" w:after="80"/>
+        <w:pStyle w:val="Heading1"/>
       </w:pPr>
       <w:r>
-        <w:rPr>
-          <w:b/>
-          <w:color w:val="1A2744"/>
-          <w:sz w:val="24"/>
-          <w:u w:val="single"/>
-        </w:rPr>
         <w:t>Profil</w:t>
       </w:r>
     </w:p>
     <w:p>
       <w:r>
-        <w:t>Senior QA — 12+ ans d'expérience sur projets complexes (web, mobile, ERP, bancaire) digitale, conformité réglementaire et applications cloud/mobile. Expert en pilotage des recettes fonctionnelles, gestion des cycles de non-régression et structuration des processus qualité. Expérience en banque, hospitality, SaaS, santé et cybersécurité. Habitué aux environnements complexes Mainframe, SAP, cloud et mobile.</w:t>
+        <w:t>J'interviens sur des projets complexes (</w:t>
+      </w:r>
+    </w:p>
+    <w:p>
+      <w:r>
+        <w:t>web app, applications mobiles Android &amp; iOS, ERP, bancaire</w:t>
+      </w:r>
+    </w:p>
+    <w:p>
+      <w:r>
+        <w:t>) pour des clients comme</w:t>
+      </w:r>
+    </w:p>
+    <w:p>
+      <w:r>
+        <w:t>BRED, Accor, Oodrive, Vinci Construction, Visiodent</w:t>
+      </w:r>
+    </w:p>
+    <w:p>
+      <w:r>
+        <w:t>, avec</w:t>
+      </w:r>
+    </w:p>
+    <w:p>
+      <w:r>
+        <w:t>une approche Agile, collaborative et orientée résultats</w:t>
+      </w:r>
+    </w:p>
+    <w:p>
+      <w:r>
+        <w:t>.</w:t>
+      </w:r>
+    </w:p>
+    <w:p>
+      <w:r>
+        <w:t>▸ Recueillir et analyser les besoins métier, définir la</w:t>
+      </w:r>
+    </w:p>
+    <w:p>
+      <w:r>
+        <w:t>stratégie de recette</w:t>
+      </w:r>
+    </w:p>
+    <w:p>
+      <w:r>
+        <w:t>et le planning des campagnes.</w:t>
+      </w:r>
+    </w:p>
+    <w:p>
+      <w:r>
+        <w:t>▸ Rédiger les</w:t>
+      </w:r>
+    </w:p>
+    <w:p>
+      <w:r>
+        <w:t>cahiers de recette</w:t>
+      </w:r>
+    </w:p>
+    <w:p>
+      <w:r>
+        <w:t>et</w:t>
+      </w:r>
+    </w:p>
+    <w:p>
+      <w:r>
+        <w:t>scénarios de test</w:t>
+      </w:r>
+    </w:p>
+    <w:p>
+      <w:r>
+        <w:t>en collaboration métier/digital.</w:t>
+      </w:r>
+    </w:p>
+    <w:p>
+      <w:r>
+        <w:t>▸ Préparer, organiser et animer les campagnes de</w:t>
+      </w:r>
+    </w:p>
+    <w:p>
+      <w:r>
+        <w:t>recette fonctionnelle</w:t>
+      </w:r>
+    </w:p>
+    <w:p>
+      <w:r>
+        <w:t>et métier.</w:t>
+      </w:r>
+    </w:p>
+    <w:p>
+      <w:r>
+        <w:t>▸ Piloter l'exécution des</w:t>
+      </w:r>
+    </w:p>
+    <w:p>
+      <w:r>
+        <w:t>tests</w:t>
+      </w:r>
+    </w:p>
+    <w:p>
+      <w:r>
+        <w:t>, suivre les</w:t>
+      </w:r>
+    </w:p>
+    <w:p>
+      <w:r>
+        <w:t>anomalies</w:t>
+      </w:r>
+    </w:p>
+    <w:p>
+      <w:r>
+        <w:t>jusqu'à résolution, coordonner les parties prenantes.</w:t>
+      </w:r>
+    </w:p>
+    <w:p>
+      <w:r>
+        <w:t>▸ Produire les reportings d'avancement,</w:t>
+      </w:r>
+    </w:p>
+    <w:p>
+      <w:r>
+        <w:t>indicateurs qualité</w:t>
+      </w:r>
+    </w:p>
+    <w:p>
+      <w:r>
+        <w:t>et synthèses de recette.</w:t>
+      </w:r>
+    </w:p>
+    <w:p>
+      <w:r>
+        <w:t>▸ Accompagner les équipes en validation pré-MEP, garantir</w:t>
+      </w:r>
+    </w:p>
+    <w:p>
+      <w:r>
+        <w:t>qualité</w:t>
+      </w:r>
+    </w:p>
+    <w:p>
+      <w:r>
+        <w:t>et</w:t>
+      </w:r>
+    </w:p>
+    <w:p>
+      <w:r>
+        <w:t>délais</w:t>
+      </w:r>
+    </w:p>
+    <w:p>
+      <w:r>
+        <w:t>projet.</w:t>
+      </w:r>
+    </w:p>
+    <w:p>
+      <w:r>
+        <w:t>▸ Expérimenter l'</w:t>
+      </w:r>
+    </w:p>
+    <w:p>
+      <w:r>
+        <w:t>IA appliquée à la QA</w:t>
+      </w:r>
+    </w:p>
+    <w:p>
+      <w:r>
+        <w:t>: agents IA, pipelines automatisés, prompt engineering.</w:t>
       </w:r>
     </w:p>
     <w:p>
       <w:pPr>
-        <w:spacing w:before="160" w:after="80"/>
+        <w:pStyle w:val="Heading1"/>
       </w:pPr>
       <w:r>
-        <w:rPr>
-          <w:b/>
-          <w:color w:val="1A2744"/>
-          <w:sz w:val="24"/>
-          <w:u w:val="single"/>
-        </w:rPr>
         <w:t>Compétences</w:t>
       </w:r>
     </w:p>
     <w:p>
+      <w:r>
+        <w:t>Pilotage QA &amp; Gouvernance</w:t>
+      </w:r>
+    </w:p>
+    <w:p>
+      <w:r>
+        <w:t>Stratégie de test · Plans de recette · Coordination QA · UAT · Non-régression · Reporting qualité · Go/No-Go · Gestion des anomalies · Suivi d'avancement · Couverture de tests · Tableaux de bord Jira · Indicateurs qualité · Agile / Scrum</w:t>
+      </w:r>
+    </w:p>
+    <w:p>
+      <w:r>
+        <w:t>Recette fonctionnelle</w:t>
+      </w:r>
+    </w:p>
+    <w:p>
+      <w:r>
+        <w:t>Tests web &amp; mobile · Rédaction de cas de test depuis les user stories · Exécution de campagnes de validation · Validation de parcours critiques · Recette fonctionnelle · Gherkin · Appium (bases légères) · Ranorex</w:t>
+      </w:r>
+    </w:p>
+    <w:p>
+      <w:r>
+        <w:t>Outils &amp; Environnements</w:t>
+      </w:r>
+    </w:p>
+    <w:p>
+      <w:r>
+        <w:t>Jira · Xray · Zephyr · TestRail · Confluence · ServiceNow · SQL Oracle · Mainframe · Charles Proxy · Crashlytics · Dynatrace · Redmine · SAP BPC · SAP HANA · Windows / macOS / Linux · Android / iOS · VMware</w:t>
+      </w:r>
+    </w:p>
+    <w:p>
+      <w:r>
+        <w:t>IA &amp; Outils techniques</w:t>
+      </w:r>
+    </w:p>
+    <w:p>
+      <w:r>
+        <w:t>Agents IA · Agentique · Prompt engineering · MCP · Claude Code · Python · Flask · GitHub Actions · LLMs cloud et locaux · Ollama · LM Studio · VS Code · Xcode</w:t>
+      </w:r>
+    </w:p>
+    <w:p>
+      <w:r>
+        <w:t>Savoir-être</w:t>
+      </w:r>
+    </w:p>
+    <w:p>
+      <w:r>
+        <w:t>Rigueur · Sens du détail · Esprit analytique · Autonomie · Proactivité · Communication claire · Collaboration avec les équipes métier et techniques · Capacité de priorisation · Curiosité technique · Orientation qualité</w:t>
+      </w:r>
+    </w:p>
+    <w:p>
       <w:pPr>
-        <w:spacing w:after="20"/>
+        <w:pStyle w:val="Heading1"/>
       </w:pPr>
       <w:r>
-        <w:rPr>
-          <w:b/>
-          <w:sz w:val="19"/>
-        </w:rPr>
-        <w:t xml:space="preserve">Pilotage QA &amp; Gouvernance  </w:t>
-      </w:r>
-      <w:r>
-        <w:rPr>
-          <w:sz w:val="18"/>
-        </w:rPr>
-        <w:t>Stratégie de test, Plans de recette, Coordination QA, UAT, Non-régression, Reporting qualité, Go/No-Go, Gestion des anomalies, Suivi d'avancement, Couverture de tests, Tableaux de bord Jira, Indicateurs qualité, Relation client &amp; parties prenantes, Agile / Scrum</w:t>
+        <w:t>Expériences</w:t>
+      </w:r>
+    </w:p>
+    <w:p>
+      <w:r>
+        <w:t>Année sabbatique — montée en compétences &amp; projets personnels</w:t>
+      </w:r>
+    </w:p>
+    <w:p>
+      <w:r>
+        <w:t>Avr. 2025 — Présent · Asie du Sud-Est</w:t>
+      </w:r>
+    </w:p>
+    <w:p>
+      <w:r>
+        <w:t>Freelance SASU</w:t>
+      </w:r>
+    </w:p>
+    <w:p>
+      <w:r>
+        <w:t>Exploré 7 pays d'Asie du Sud-Est : 🇹🇭 Thaïlande, 🇲🇾 Malaisie, 🇰🇭 Cambodge, 🇮🇩 Indonésie, 🇵🇭 Philippines, 🇻🇳 Vietnam, 🇱🇦 Laos — immersion internationale.</w:t>
+      </w:r>
+    </w:p>
+    <w:p>
+      <w:r>
+        <w:t>Monter en compétences sur</w:t>
+      </w:r>
+    </w:p>
+    <w:p>
+      <w:r>
+        <w:t>IA générative</w:t>
+      </w:r>
+    </w:p>
+    <w:p>
+      <w:r>
+        <w:t>,</w:t>
+      </w:r>
+    </w:p>
+    <w:p>
+      <w:r>
+        <w:t>prompt engineering</w:t>
+      </w:r>
+    </w:p>
+    <w:p>
+      <w:r>
+        <w:t>et</w:t>
+      </w:r>
+    </w:p>
+    <w:p>
+      <w:r>
+        <w:t>digital product management</w:t>
+      </w:r>
+    </w:p>
+    <w:p>
+      <w:r>
+        <w:t>(formations continues).</w:t>
+      </w:r>
+    </w:p>
+    <w:p>
+      <w:r>
+        <w:t>Développer des projets</w:t>
+      </w:r>
+    </w:p>
+    <w:p>
+      <w:r>
+        <w:t>agentiques</w:t>
+      </w:r>
+    </w:p>
+    <w:p>
+      <w:r>
+        <w:t>,</w:t>
+      </w:r>
+    </w:p>
+    <w:p>
+      <w:r>
+        <w:t>assistants autonomes</w:t>
+      </w:r>
+    </w:p>
+    <w:p>
+      <w:r>
+        <w:t>et</w:t>
+      </w:r>
+    </w:p>
+    <w:p>
+      <w:r>
+        <w:t>chasse d'emploi pilotée par IA</w:t>
+      </w:r>
+    </w:p>
+    <w:p>
+      <w:r>
+        <w:t>.</w:t>
+      </w:r>
+    </w:p>
+    <w:p>
+      <w:r>
+        <w:t>Renforcer la stack technique sur Python, Flask, GitHub Actions, MCP et</w:t>
+      </w:r>
+    </w:p>
+    <w:p>
+      <w:r>
+        <w:t>LLMs cloud / locaux</w:t>
+      </w:r>
+    </w:p>
+    <w:p>
+      <w:r>
+        <w:t>.</w:t>
+      </w:r>
+    </w:p>
+    <w:p>
+      <w:r>
+        <w:t>Environnement : Python, Flask, Hermes Agent, DeepSeek, GitHub Actions, MCP, Ollama, LM Studio.</w:t>
+      </w:r>
+    </w:p>
+    <w:p>
+      <w:r>
+        <w:t>BRED Banque Populaire — Facturation électronique</w:t>
+      </w:r>
+    </w:p>
+    <w:p>
+      <w:r>
+        <w:t>Avr. 2023 — Avr. 2025 · Paris</w:t>
+      </w:r>
+    </w:p>
+    <w:p>
+      <w:r>
+        <w:t>Consultant QA Senior — Freelance SASU</w:t>
+      </w:r>
+    </w:p>
+    <w:p>
+      <w:r>
+        <w:t>Piloter la</w:t>
+      </w:r>
+    </w:p>
+    <w:p>
+      <w:r>
+        <w:t>recette fonctionnelle</w:t>
+      </w:r>
+    </w:p>
+    <w:p>
+      <w:r>
+        <w:t>sur un programme de</w:t>
+      </w:r>
+    </w:p>
+    <w:p>
+      <w:r>
+        <w:t>conformité réglementaire</w:t>
+      </w:r>
+    </w:p>
+    <w:p>
+      <w:r>
+        <w:t>— dématérialisation des factures, périmètres</w:t>
+      </w:r>
+    </w:p>
+    <w:p>
+      <w:r>
+        <w:t>P2P/O2C</w:t>
+      </w:r>
+    </w:p>
+    <w:p>
+      <w:r>
+        <w:t>.</w:t>
+      </w:r>
+    </w:p>
+    <w:p>
+      <w:r>
+        <w:t>Concevoir, planifier et exécuter des campagnes de</w:t>
+      </w:r>
+    </w:p>
+    <w:p>
+      <w:r>
+        <w:t>tests fonctionnels</w:t>
+      </w:r>
+    </w:p>
+    <w:p>
+      <w:r>
+        <w:t>,</w:t>
+      </w:r>
+    </w:p>
+    <w:p>
+      <w:r>
+        <w:t>de régression</w:t>
+      </w:r>
+    </w:p>
+    <w:p>
+      <w:r>
+        <w:t>; rédiger et maintenir les</w:t>
+      </w:r>
+    </w:p>
+    <w:p>
+      <w:r>
+        <w:t>plans de test</w:t>
+      </w:r>
+    </w:p>
+    <w:p>
+      <w:r>
+        <w:t>,</w:t>
+      </w:r>
+    </w:p>
+    <w:p>
+      <w:r>
+        <w:t>cahiers de recette</w:t>
+      </w:r>
+    </w:p>
+    <w:p>
+      <w:r>
+        <w:t>,</w:t>
+      </w:r>
+    </w:p>
+    <w:p>
+      <w:r>
+        <w:t>cas de tests</w:t>
+      </w:r>
+    </w:p>
+    <w:p>
+      <w:r>
+        <w:t>,</w:t>
+      </w:r>
+    </w:p>
+    <w:p>
+      <w:r>
+        <w:t>scénarios de test</w:t>
+      </w:r>
+    </w:p>
+    <w:p>
+      <w:r>
+        <w:t>et matrices de couverture en priorisant selon les risques et l'impact métier.</w:t>
+      </w:r>
+    </w:p>
+    <w:p>
+      <w:r>
+        <w:t>Coordonner des campagnes multi-équipes dans</w:t>
+      </w:r>
+    </w:p>
+    <w:p>
+      <w:r>
+        <w:t>Jira/Xray</w:t>
+      </w:r>
+    </w:p>
+    <w:p>
+      <w:r>
+        <w:t>, suivi de couverture, gestion des anomalies et reporting</w:t>
+      </w:r>
+    </w:p>
+    <w:p>
+      <w:r>
+        <w:t>Go/No-Go</w:t>
+      </w:r>
+    </w:p>
+    <w:p>
+      <w:r>
+        <w:t>.</w:t>
+      </w:r>
+    </w:p>
+    <w:p>
+      <w:r>
+        <w:t>Synchroniser avec</w:t>
+      </w:r>
+    </w:p>
+    <w:p>
+      <w:r>
+        <w:t>équipes métier</w:t>
+      </w:r>
+    </w:p>
+    <w:p>
+      <w:r>
+        <w:t>,</w:t>
+      </w:r>
+    </w:p>
+    <w:p>
+      <w:r>
+        <w:t>BA</w:t>
+      </w:r>
+    </w:p>
+    <w:p>
+      <w:r>
+        <w:t>,</w:t>
+      </w:r>
+    </w:p>
+    <w:p>
+      <w:r>
+        <w:t>développeurs</w:t>
+      </w:r>
+    </w:p>
+    <w:p>
+      <w:r>
+        <w:t>et</w:t>
+      </w:r>
+    </w:p>
+    <w:p>
+      <w:r>
+        <w:t>support</w:t>
+      </w:r>
+    </w:p>
+    <w:p>
+      <w:r>
+        <w:t>en</w:t>
+      </w:r>
+    </w:p>
+    <w:p>
+      <w:r>
+        <w:t>Agile / Scrum</w:t>
+      </w:r>
+    </w:p>
+    <w:p>
+      <w:r>
+        <w:t>.</w:t>
+      </w:r>
+    </w:p>
+    <w:p>
+      <w:r>
+        <w:t>Sécuriser les cycles de</w:t>
+      </w:r>
+    </w:p>
+    <w:p>
+      <w:r>
+        <w:t>non-régression</w:t>
+      </w:r>
+    </w:p>
+    <w:p>
+      <w:r>
+        <w:t>dans un environnement</w:t>
+      </w:r>
+    </w:p>
+    <w:p>
+      <w:r>
+        <w:t>Mainframe / SQL Oracle</w:t>
+      </w:r>
+    </w:p>
+    <w:p>
+      <w:r>
+        <w:t>.</w:t>
+      </w:r>
+    </w:p>
+    <w:p>
+      <w:r>
+        <w:t>Environnement : Jira, Xray, SQL Oracle, Mainframe, Corcentric, ServiceNow.</w:t>
+      </w:r>
+    </w:p>
+    <w:p>
+      <w:r>
+        <w:t>Accor — Applications mobiles internationales</w:t>
+      </w:r>
+    </w:p>
+    <w:p>
+      <w:r>
+        <w:t>Sept. 2019 — Déc. 2022 · Paris</w:t>
+      </w:r>
+    </w:p>
+    <w:p>
+      <w:r>
+        <w:t>Référent QA Mobile — Consultant</w:t>
+      </w:r>
+    </w:p>
+    <w:p>
+      <w:r>
+        <w:t>Référent QA sur applications</w:t>
+      </w:r>
+    </w:p>
+    <w:p>
+      <w:r>
+        <w:t>Android/iOS</w:t>
+      </w:r>
+    </w:p>
+    <w:p>
+      <w:r>
+        <w:t>déployées dans 100+ pays : validation fonctionnelle, UAT et non-régression.</w:t>
+      </w:r>
+    </w:p>
+    <w:p>
+      <w:r>
+        <w:t>Concevoir, planifier et exécuter des campagnes de</w:t>
+      </w:r>
+    </w:p>
+    <w:p>
+      <w:r>
+        <w:t>tests fonctionnels</w:t>
+      </w:r>
+    </w:p>
+    <w:p>
+      <w:r>
+        <w:t>,</w:t>
+      </w:r>
+    </w:p>
+    <w:p>
+      <w:r>
+        <w:t>de régression</w:t>
+      </w:r>
+    </w:p>
+    <w:p>
+      <w:r>
+        <w:t>et de compatibilité multi-versions Android/iOS ; rédiger et maintenir les</w:t>
+      </w:r>
+    </w:p>
+    <w:p>
+      <w:r>
+        <w:t>plans de test</w:t>
+      </w:r>
+    </w:p>
+    <w:p>
+      <w:r>
+        <w:t>,</w:t>
+      </w:r>
+    </w:p>
+    <w:p>
+      <w:r>
+        <w:t>cahiers de recette</w:t>
+      </w:r>
+    </w:p>
+    <w:p>
+      <w:r>
+        <w:t>,</w:t>
+      </w:r>
+    </w:p>
+    <w:p>
+      <w:r>
+        <w:t>cas de tests</w:t>
+      </w:r>
+    </w:p>
+    <w:p>
+      <w:r>
+        <w:t>,</w:t>
+      </w:r>
+    </w:p>
+    <w:p>
+      <w:r>
+        <w:t>scénarios de test</w:t>
+      </w:r>
+    </w:p>
+    <w:p>
+      <w:r>
+        <w:t>en priorisant selon les risques et l'impact métier.</w:t>
+      </w:r>
+    </w:p>
+    <w:p>
+      <w:r>
+        <w:t>Co-construire les</w:t>
+      </w:r>
+    </w:p>
+    <w:p>
+      <w:r>
+        <w:t>user stories</w:t>
+      </w:r>
+    </w:p>
+    <w:p>
+      <w:r>
+        <w:t>avec PO et développeurs pour renforcer la testabilité.</w:t>
+      </w:r>
+    </w:p>
+    <w:p>
+      <w:r>
+        <w:t>Formaliser les scénarios critiques en</w:t>
+      </w:r>
+    </w:p>
+    <w:p>
+      <w:r>
+        <w:t>Gherkin</w:t>
+      </w:r>
+    </w:p>
+    <w:p>
+      <w:r>
+        <w:t>pour l'alignement avec l'</w:t>
+      </w:r>
+    </w:p>
+    <w:p>
+      <w:r>
+        <w:t>automatisation mobile</w:t>
+      </w:r>
+    </w:p>
+    <w:p>
+      <w:r>
+        <w:t>.</w:t>
+      </w:r>
+    </w:p>
+    <w:p>
+      <w:r>
+        <w:t>Valider les flux transactionnels multi-appareils/multi-langues, reporting à la direction produit.</w:t>
+      </w:r>
+    </w:p>
+    <w:p>
+      <w:r>
+        <w:t>Environnement : Jira, Xray,</w:t>
+      </w:r>
+    </w:p>
+    <w:p>
+      <w:r>
+        <w:t>Gherkin</w:t>
+      </w:r>
+    </w:p>
+    <w:p>
+      <w:r>
+        <w:t>, Charles Proxy, Crashlytics, Android, iOS, Confluence.</w:t>
+      </w:r>
+    </w:p>
+    <w:p>
+      <w:r>
+        <w:t>Oodrive —</w:t>
+      </w:r>
+    </w:p>
+    <w:p>
+      <w:r>
+        <w:t>Cloud souverain</w:t>
+      </w:r>
+    </w:p>
+    <w:p>
+      <w:r>
+        <w:t>B2B</w:t>
+      </w:r>
+    </w:p>
+    <w:p>
+      <w:r>
+        <w:t>Janv. 2017 — Avr. 2019 · Paris</w:t>
+      </w:r>
+    </w:p>
+    <w:p>
+      <w:r>
+        <w:t>Ingénieur Qualité Logiciel / Responsable QA</w:t>
+      </w:r>
+    </w:p>
+    <w:p>
+      <w:r>
+        <w:t>Responsable qualité sur applications critiques</w:t>
+      </w:r>
+    </w:p>
+    <w:p>
+      <w:r>
+        <w:t>B2B/B2C</w:t>
+      </w:r>
+    </w:p>
+    <w:p>
+      <w:r>
+        <w:t>cloud et desktop :</w:t>
+      </w:r>
+    </w:p>
+    <w:p>
+      <w:r>
+        <w:t>WebSynchro</w:t>
+      </w:r>
+    </w:p>
+    <w:p>
+      <w:r>
+        <w:t>(synchronisation fichiers),</w:t>
+      </w:r>
+    </w:p>
+    <w:p>
+      <w:r>
+        <w:t>PostFiles</w:t>
+      </w:r>
+    </w:p>
+    <w:p>
+      <w:r>
+        <w:t>(partage sécurisé),</w:t>
+      </w:r>
+    </w:p>
+    <w:p>
+      <w:r>
+        <w:t>BoardNox</w:t>
+      </w:r>
+    </w:p>
+    <w:p>
+      <w:r>
+        <w:t>(solution de gouvernance pour comités de direction / CA).</w:t>
+      </w:r>
+    </w:p>
+    <w:p>
+      <w:r>
+        <w:t>Concevoir, planifier et exécuter des campagnes de</w:t>
+      </w:r>
+    </w:p>
+    <w:p>
+      <w:r>
+        <w:t>tests fonctionnels</w:t>
+      </w:r>
+    </w:p>
+    <w:p>
+      <w:r>
+        <w:t>,</w:t>
+      </w:r>
+    </w:p>
+    <w:p>
+      <w:r>
+        <w:t>de régression</w:t>
+      </w:r>
+    </w:p>
+    <w:p>
+      <w:r>
+        <w:t>, de compatibilité multi-navigateurs et responsive ; rédiger et maintenir les</w:t>
+      </w:r>
+    </w:p>
+    <w:p>
+      <w:r>
+        <w:t>plans de test</w:t>
+      </w:r>
+    </w:p>
+    <w:p>
+      <w:r>
+        <w:t>,</w:t>
+      </w:r>
+    </w:p>
+    <w:p>
+      <w:r>
+        <w:t>cahiers de recette</w:t>
+      </w:r>
+    </w:p>
+    <w:p>
+      <w:r>
+        <w:t>,</w:t>
+      </w:r>
+    </w:p>
+    <w:p>
+      <w:r>
+        <w:t>cas de tests</w:t>
+      </w:r>
+    </w:p>
+    <w:p>
+      <w:r>
+        <w:t>,</w:t>
+      </w:r>
+    </w:p>
+    <w:p>
+      <w:r>
+        <w:t>scénarios de test</w:t>
+      </w:r>
+    </w:p>
+    <w:p>
+      <w:r>
+        <w:t>en priorisant selon les risques et l'impact métier.</w:t>
+      </w:r>
+    </w:p>
+    <w:p>
+      <w:r>
+        <w:t>Structurer les pratiques QA : templates, critères, gestion des anomalies dans</w:t>
+      </w:r>
+    </w:p>
+    <w:p>
+      <w:r>
+        <w:t>Jira/Zephyr</w:t>
+      </w:r>
+    </w:p>
+    <w:p>
+      <w:r>
+        <w:t>.</w:t>
+      </w:r>
+    </w:p>
+    <w:p>
+      <w:r>
+        <w:t>Support N3</w:t>
+      </w:r>
+    </w:p>
+    <w:p>
+      <w:r>
+        <w:t>grands comptes, introduction</w:t>
+      </w:r>
+    </w:p>
+    <w:p>
+      <w:r>
+        <w:t>automatisation Ranorex</w:t>
+      </w:r>
+    </w:p>
+    <w:p>
+      <w:r>
+        <w:t>, et collaboration</w:t>
+      </w:r>
+    </w:p>
+    <w:p>
+      <w:r>
+        <w:t>équipes dev/support/PO</w:t>
+      </w:r>
+    </w:p>
+    <w:p>
+      <w:r>
+        <w:t>.</w:t>
+      </w:r>
+    </w:p>
+    <w:p>
+      <w:r>
+        <w:t>Environnement : Jira, Zephyr,</w:t>
+      </w:r>
+    </w:p>
+    <w:p>
+      <w:r>
+        <w:t>Ranorex</w:t>
+      </w:r>
+    </w:p>
+    <w:p>
+      <w:r>
+        <w:t>, Confluence,</w:t>
+      </w:r>
+    </w:p>
+    <w:p>
+      <w:r>
+        <w:t>Windows, macOS, Linux</w:t>
+      </w:r>
+    </w:p>
+    <w:p>
+      <w:r>
+        <w:t>.</w:t>
+      </w:r>
+    </w:p>
+    <w:p>
+      <w:r>
+        <w:t>Visiodent — Logiciels santé</w:t>
+      </w:r>
+    </w:p>
+    <w:p>
+      <w:r>
+        <w:t>Juin — Août 2019 · Paris</w:t>
+      </w:r>
+    </w:p>
+    <w:p>
+      <w:r>
+        <w:t>Responsable Qualité Logiciel</w:t>
+      </w:r>
+    </w:p>
+    <w:p>
+      <w:r>
+        <w:t>Encadrer une équipe de</w:t>
+      </w:r>
+    </w:p>
+    <w:p>
+      <w:r>
+        <w:t>testeurs</w:t>
+      </w:r>
+    </w:p>
+    <w:p>
+      <w:r>
+        <w:t>et superviser un</w:t>
+      </w:r>
+    </w:p>
+    <w:p>
+      <w:r>
+        <w:t>prestataire externe d'automatisation</w:t>
+      </w:r>
+    </w:p>
+    <w:p>
+      <w:r>
+        <w:t>sur le logiciel métier santé</w:t>
+      </w:r>
+    </w:p>
+    <w:p>
+      <w:r>
+        <w:t>Veasy</w:t>
+      </w:r>
+    </w:p>
+    <w:p>
+      <w:r>
+        <w:t>.</w:t>
+      </w:r>
+    </w:p>
+    <w:p>
+      <w:r>
+        <w:t>Concevoir, planifier et exécuter des campagnes de</w:t>
+      </w:r>
+    </w:p>
+    <w:p>
+      <w:r>
+        <w:t>tests fonctionnels</w:t>
+      </w:r>
+    </w:p>
+    <w:p>
+      <w:r>
+        <w:t>,</w:t>
+      </w:r>
+    </w:p>
+    <w:p>
+      <w:r>
+        <w:t>de régression</w:t>
+      </w:r>
+    </w:p>
+    <w:p>
+      <w:r>
+        <w:t>et de compatibilité multi-navigateurs sur les parcours métier et réglementaires.</w:t>
+      </w:r>
+    </w:p>
+    <w:p>
+      <w:r>
+        <w:t>Rédiger et maintenir les</w:t>
+      </w:r>
+    </w:p>
+    <w:p>
+      <w:r>
+        <w:t>plans de test</w:t>
+      </w:r>
+    </w:p>
+    <w:p>
+      <w:r>
+        <w:t>,</w:t>
+      </w:r>
+    </w:p>
+    <w:p>
+      <w:r>
+        <w:t>cahiers de recette</w:t>
+      </w:r>
+    </w:p>
+    <w:p>
+      <w:r>
+        <w:t>,</w:t>
+      </w:r>
+    </w:p>
+    <w:p>
+      <w:r>
+        <w:t>cas de tests</w:t>
+      </w:r>
+    </w:p>
+    <w:p>
+      <w:r>
+        <w:t>,</w:t>
+      </w:r>
+    </w:p>
+    <w:p>
+      <w:r>
+        <w:t>scénarios de test</w:t>
+      </w:r>
+    </w:p>
+    <w:p>
+      <w:r>
+        <w:t>et matrices de couverture, prioriser selon les risques fonctionnels et l'impact métier.</w:t>
+      </w:r>
+    </w:p>
+    <w:p>
+      <w:r>
+        <w:t>Intégrer la</w:t>
+      </w:r>
+    </w:p>
+    <w:p>
+      <w:r>
+        <w:t>Carte Vitale</w:t>
+      </w:r>
+    </w:p>
+    <w:p>
+      <w:r>
+        <w:t>dans les scénarios de test pour couvrir les exigences réglementaires.</w:t>
+      </w:r>
+    </w:p>
+    <w:p>
+      <w:r>
+        <w:t>Coordonner les validations avec</w:t>
+      </w:r>
+    </w:p>
+    <w:p>
+      <w:r>
+        <w:t>développeurs</w:t>
+      </w:r>
+    </w:p>
+    <w:p>
+      <w:r>
+        <w:t>,</w:t>
+      </w:r>
+    </w:p>
+    <w:p>
+      <w:r>
+        <w:t>PO</w:t>
+      </w:r>
+    </w:p>
+    <w:p>
+      <w:r>
+        <w:t>et</w:t>
+      </w:r>
+    </w:p>
+    <w:p>
+      <w:r>
+        <w:t>équipes métier</w:t>
+      </w:r>
+    </w:p>
+    <w:p>
+      <w:r>
+        <w:t>.</w:t>
+      </w:r>
+    </w:p>
+    <w:p>
+      <w:r>
+        <w:t>Environnement : Jira, Xray, Dynatrace, CloudNetCare, Excel.</w:t>
+      </w:r>
+    </w:p>
+    <w:p>
+      <w:r>
+        <w:t>Vinci Construction —</w:t>
+      </w:r>
+    </w:p>
+    <w:p>
+      <w:r>
+        <w:t>SAP BPC</w:t>
+      </w:r>
+    </w:p>
+    <w:p>
+      <w:r>
+        <w:t>Oct. 2016 — Janv. 2017 · Paris</w:t>
+      </w:r>
+    </w:p>
+    <w:p>
+      <w:r>
+        <w:t>Consultant QA / Ingénieur Qualité</w:t>
+      </w:r>
+    </w:p>
+    <w:p>
+      <w:r>
+        <w:t>Recette fonctionnelle d'applications</w:t>
+      </w:r>
+    </w:p>
+    <w:p>
+      <w:r>
+        <w:t>SAP BPC</w:t>
+      </w:r>
+    </w:p>
+    <w:p>
+      <w:r>
+        <w:t>: conformité, intégrité des données et cohérence des états financiers.</w:t>
+      </w:r>
+    </w:p>
+    <w:p>
+      <w:r>
+        <w:t>Rédiger des</w:t>
+      </w:r>
+    </w:p>
+    <w:p>
+      <w:r>
+        <w:t>cas de tests</w:t>
+      </w:r>
+    </w:p>
+    <w:p>
+      <w:r>
+        <w:t>depuis les</w:t>
+      </w:r>
+    </w:p>
+    <w:p>
+      <w:r>
+        <w:t>besoins métier</w:t>
+      </w:r>
+    </w:p>
+    <w:p>
+      <w:r>
+        <w:t>, élaborer les</w:t>
+      </w:r>
+    </w:p>
+    <w:p>
+      <w:r>
+        <w:t>plans de test</w:t>
+      </w:r>
+    </w:p>
+    <w:p>
+      <w:r>
+        <w:t>, et exécuter les campagnes de validation sur les applicatifs</w:t>
+      </w:r>
+    </w:p>
+    <w:p>
+      <w:r>
+        <w:t>SAP BPC</w:t>
+      </w:r>
+    </w:p>
+    <w:p>
+      <w:r>
+        <w:t>.</w:t>
+      </w:r>
+    </w:p>
+    <w:p>
+      <w:r>
+        <w:t>Collaborer avec les</w:t>
+      </w:r>
+    </w:p>
+    <w:p>
+      <w:r>
+        <w:t>équipes métier</w:t>
+      </w:r>
+    </w:p>
+    <w:p>
+      <w:r>
+        <w:t>pour sécuriser les validations.</w:t>
+      </w:r>
+    </w:p>
+    <w:p>
+      <w:r>
+        <w:t>Environnement : Redmine, TestRail,</w:t>
+      </w:r>
+    </w:p>
+    <w:p>
+      <w:r>
+        <w:t>SAP BPC</w:t>
+      </w:r>
+    </w:p>
+    <w:p>
+      <w:r>
+        <w:t>, SAP HANA.</w:t>
+      </w:r>
+    </w:p>
+    <w:p>
+      <w:r>
+        <w:t>Profil Technology — sécurité &amp; filtrage web</w:t>
+      </w:r>
+    </w:p>
+    <w:p>
+      <w:r>
+        <w:t>Janv. 2011 — Sept. 2016 · Paris</w:t>
+      </w:r>
+    </w:p>
+    <w:p>
+      <w:r>
+        <w:t>Ingénieur Tests &amp; Support Niveau 3</w:t>
+      </w:r>
+    </w:p>
+    <w:p>
+      <w:r>
+        <w:t>Rédiger des</w:t>
+      </w:r>
+    </w:p>
+    <w:p>
+      <w:r>
+        <w:t>cas de tests</w:t>
+      </w:r>
+    </w:p>
+    <w:p>
+      <w:r>
+        <w:t>depuis les</w:t>
+      </w:r>
+    </w:p>
+    <w:p>
+      <w:r>
+        <w:t>users stories</w:t>
+      </w:r>
+    </w:p>
+    <w:p>
+      <w:r>
+        <w:t>, élaborer les</w:t>
+      </w:r>
+    </w:p>
+    <w:p>
+      <w:r>
+        <w:t>plans de test</w:t>
+      </w:r>
+    </w:p>
+    <w:p>
+      <w:r>
+        <w:t>, et exécuter les campagnes de validation sur les solutions de sécurité et filtrage web.</w:t>
+      </w:r>
+    </w:p>
+    <w:p>
+      <w:r>
+        <w:t>Conduire des campagnes de</w:t>
+      </w:r>
+    </w:p>
+    <w:p>
+      <w:r>
+        <w:t>tests fonctionnels</w:t>
+      </w:r>
+    </w:p>
+    <w:p>
+      <w:r>
+        <w:t>et non-régression multi-plateformes (Witigo, Bitdefender, WebFilter).</w:t>
+      </w:r>
+    </w:p>
+    <w:p>
+      <w:r>
+        <w:t>Développer des scripts d'</w:t>
+      </w:r>
+    </w:p>
+    <w:p>
+      <w:r>
+        <w:t>automatisation</w:t>
+      </w:r>
+    </w:p>
+    <w:p>
+      <w:r>
+        <w:t>pour accélérer les validations et la détection de régressions.</w:t>
+      </w:r>
+    </w:p>
+    <w:p>
+      <w:r>
+        <w:t>Gérer un</w:t>
+      </w:r>
+    </w:p>
+    <w:p>
+      <w:r>
+        <w:t>laboratoire de tests sécurité</w:t>
+      </w:r>
+    </w:p>
+    <w:p>
+      <w:r>
+        <w:t>sur</w:t>
+      </w:r>
+    </w:p>
+    <w:p>
+      <w:r>
+        <w:t>Windows, macOS, Linux</w:t>
+      </w:r>
+    </w:p>
+    <w:p>
+      <w:r>
+        <w:t>, VMware.</w:t>
+      </w:r>
+    </w:p>
+    <w:p>
+      <w:r>
+        <w:t>Support N3</w:t>
+      </w:r>
+    </w:p>
+    <w:p>
+      <w:r>
+        <w:t>clients grands comptes en lien avec développement et support.</w:t>
+      </w:r>
+    </w:p>
+    <w:p>
+      <w:r>
+        <w:t>Environnement : VMware,</w:t>
+      </w:r>
+    </w:p>
+    <w:p>
+      <w:r>
+        <w:t>Windows, macOS, Linux</w:t>
+      </w:r>
+    </w:p>
+    <w:p>
+      <w:r>
+        <w:t>, Bitdefender.</w:t>
       </w:r>
     </w:p>
     <w:p>
       <w:pPr>
-        <w:spacing w:after="20"/>
+        <w:pStyle w:val="Heading1"/>
       </w:pPr>
       <w:r>
-        <w:rPr>
-          <w:b/>
-          <w:sz w:val="19"/>
-        </w:rPr>
-        <w:t xml:space="preserve">Recette fonctionnelle  </w:t>
-      </w:r>
-      <w:r>
-        <w:rPr>
-          <w:sz w:val="18"/>
-        </w:rPr>
-        <w:t>Tests web &amp; mobile, Rédaction de cas de test depuis les user stories, Exécution de campagnes de validation, Validation de parcours critiques, Recette fonctionnelle, Gherkin, Appium (bases légères), Ranorex</w:t>
+        <w:t>Projets personnels</w:t>
+      </w:r>
+    </w:p>
+    <w:p>
+      <w:r>
+        <w:t>Pipelines QA Agentic — orchestration multi-agents</w:t>
+      </w:r>
+    </w:p>
+    <w:p>
+      <w:r>
+        <w:t>Workflows agentiques pour la QA :</w:t>
+      </w:r>
+    </w:p>
+    <w:p>
+      <w:r>
+        <w:t>délégation de tâches</w:t>
+      </w:r>
+    </w:p>
+    <w:p>
+      <w:r>
+        <w:t>, génération de tests par IA, analyse de régression assistée.</w:t>
+      </w:r>
+    </w:p>
+    <w:p>
+      <w:r>
+        <w:t>Hermes Agent, MCP, Claude Code, Codex CLI, DeepSeek, Gemma.</w:t>
+      </w:r>
+    </w:p>
+    <w:p>
+      <w:r>
+        <w:t>Nous AI News</w:t>
+      </w:r>
+    </w:p>
+    <w:p>
+      <w:r>
+        <w:t>GitHub</w:t>
+      </w:r>
+    </w:p>
+    <w:p>
+      <w:r>
+        <w:t>— agrégation IA temps réel</w:t>
+      </w:r>
+    </w:p>
+    <w:p>
+      <w:r>
+        <w:t>Pipeline ingestion</w:t>
+      </w:r>
+    </w:p>
+    <w:p>
+      <w:r>
+        <w:t>86 flux RSS</w:t>
+      </w:r>
+    </w:p>
+    <w:p>
+      <w:r>
+        <w:t>avec extraction d'entités et</w:t>
+      </w:r>
+    </w:p>
+    <w:p>
+      <w:r>
+        <w:t>catégorisation LLM</w:t>
+      </w:r>
+    </w:p>
+    <w:p>
+      <w:r>
+        <w:t>.</w:t>
+      </w:r>
+    </w:p>
+    <w:p>
+      <w:r>
+        <w:t>Moteur d'auto-amélioration continue</w:t>
+      </w:r>
+    </w:p>
+    <w:p>
+      <w:r>
+        <w:t>(re-scoring perceurs, boucles RLHF, optimisation prompts auto).</w:t>
+      </w:r>
+    </w:p>
+    <w:p>
+      <w:r>
+        <w:t>Next.js 14</w:t>
+      </w:r>
+    </w:p>
+    <w:p>
+      <w:r>
+        <w:t>+</w:t>
+      </w:r>
+    </w:p>
+    <w:p>
+      <w:r>
+        <w:t>Supabase</w:t>
+      </w:r>
+    </w:p>
+    <w:p>
+      <w:r>
+        <w:t>, 263 tests. CI/CD GitHub Actions.</w:t>
+      </w:r>
+    </w:p>
+    <w:p>
+      <w:r>
+        <w:t>TypeScript, Tailwind, OpenAI GPT-5 nano.</w:t>
+      </w:r>
+    </w:p>
+    <w:p>
+      <w:r>
+        <w:t>JobHunt — dashboard QA piloté par IA</w:t>
+      </w:r>
+    </w:p>
+    <w:p>
+      <w:r>
+        <w:t>GitHub</w:t>
+      </w:r>
+    </w:p>
+    <w:p>
+      <w:r>
+        <w:t>Pipeline de scraping</w:t>
+      </w:r>
+    </w:p>
+    <w:p>
+      <w:r>
+        <w:t>multi-sources orchestré par crons horaires</w:t>
+      </w:r>
+    </w:p>
+    <w:p>
+      <w:r>
+        <w:t>(LinkedIn, Free-Work, Indeed, Malt, 8+ plateformes).</w:t>
+      </w:r>
+    </w:p>
+    <w:p>
+      <w:r>
+        <w:t>Moteur de matching CV/offres</w:t>
+      </w:r>
+    </w:p>
+    <w:p>
+      <w:r>
+        <w:t>avec scoring /100, détection de doublons et analyse TJM par marché. Auto-enrichissement IA des offres (tech stack, salaire). Génération automatisée de lettres de motivation. Alertes email via polling IMAP et rapports hebdomadaires. Dashboard temps réel. Suite complète de tests :</w:t>
+      </w:r>
+    </w:p>
+    <w:p>
+      <w:r>
+        <w:t>83 tests unitaires/intégration</w:t>
+      </w:r>
+    </w:p>
+    <w:p>
+      <w:r>
+        <w:t>,</w:t>
+      </w:r>
+    </w:p>
+    <w:p>
+      <w:r>
+        <w:t>19 scénarios BDD Gherkin</w:t>
+      </w:r>
+    </w:p>
+    <w:p>
+      <w:r>
+        <w:t>, tests Playwright E2E. CI/CD GitHub Actions + Render. Auto-healing du pipeline.</w:t>
+      </w:r>
+    </w:p>
+    <w:p>
+      <w:r>
+        <w:t>Python, Flask, DeepSeek.</w:t>
       </w:r>
     </w:p>
     <w:p>
       <w:pPr>
-        <w:spacing w:after="20"/>
+        <w:pStyle w:val="Heading1"/>
       </w:pPr>
       <w:r>
-        <w:rPr>
-          <w:b/>
-          <w:sz w:val="19"/>
-        </w:rPr>
-        <w:t xml:space="preserve">Outils &amp; Environnements  </w:t>
-      </w:r>
-      <w:r>
-        <w:rPr>
-          <w:sz w:val="18"/>
-        </w:rPr>
-        <w:t>Jira, Xray, Zephyr, TestRail, Confluence, ServiceNow, SQL Oracle, Mainframe, Charles Proxy, Crashlytics, Dynatrace, Redmine, SAP BPC, SAP HANA, Windows / macOS / Linux, Android / iOS, VMware</w:t>
+        <w:t>Formations</w:t>
+      </w:r>
+    </w:p>
+    <w:p>
+      <w:r>
+        <w:t>ISTQB</w:t>
+      </w:r>
+    </w:p>
+    <w:p>
+      <w:r>
+        <w:t>— Fondation du test logiciel</w:t>
+      </w:r>
+    </w:p>
+    <w:p>
+      <w:r>
+        <w:t>· Learning Tree, 2015</w:t>
       </w:r>
     </w:p>
     <w:p>
       <w:pPr>
-        <w:spacing w:after="20"/>
+        <w:pStyle w:val="Heading1"/>
       </w:pPr>
       <w:r>
-        <w:rPr>
-          <w:b/>
-          <w:sz w:val="19"/>
-        </w:rPr>
-        <w:t xml:space="preserve">IA &amp; Outils techniques  </w:t>
-      </w:r>
-      <w:r>
-        <w:rPr>
-          <w:sz w:val="18"/>
-        </w:rPr>
-        <w:t>Agents IA, Agentique, Prompt engineering, MCP, Claude Code, Python, Flask, GitHub Actions, LLMs cloud et locaux, Ollama, LM Studio, VS Code, Xcode</w:t>
+        <w:t>Certifications</w:t>
+      </w:r>
+    </w:p>
+    <w:p>
+      <w:r>
+        <w:t>PSPO</w:t>
+      </w:r>
+    </w:p>
+    <w:p>
+      <w:r>
+        <w:t>— Professional Scrum Product Owner</w:t>
+      </w:r>
+    </w:p>
+    <w:p>
+      <w:r>
+        <w:t>· 🔗</w:t>
+      </w:r>
+    </w:p>
+    <w:p>
+      <w:r>
+        <w:t>Certificat Scrum.org</w:t>
+      </w:r>
+    </w:p>
+    <w:p>
+      <w:r>
+        <w:t>, 2020</w:t>
+      </w:r>
+    </w:p>
+    <w:p>
+      <w:r>
+        <w:t>IA Générative &amp; Prompt Engineering</w:t>
+      </w:r>
+    </w:p>
+    <w:p>
+      <w:r>
+        <w:t>· 🔗</w:t>
+      </w:r>
+    </w:p>
+    <w:p>
+      <w:r>
+        <w:t>Certificat Google / Coursera</w:t>
+      </w:r>
+    </w:p>
+    <w:p>
+      <w:r>
+        <w:t>, 2025</w:t>
+      </w:r>
+    </w:p>
+    <w:p>
+      <w:r>
+        <w:t>Digital Product Management</w:t>
+      </w:r>
+    </w:p>
+    <w:p>
+      <w:r>
+        <w:t>· 🔗</w:t>
+      </w:r>
+    </w:p>
+    <w:p>
+      <w:r>
+        <w:t>Certificat Coursera</w:t>
+      </w:r>
+    </w:p>
+    <w:p>
+      <w:r>
+        <w:t>, 2025</w:t>
+      </w:r>
+    </w:p>
+    <w:p>
+      <w:r>
+        <w:t>Introduction to Python</w:t>
+      </w:r>
+    </w:p>
+    <w:p>
+      <w:r>
+        <w:t>· 🔗</w:t>
+      </w:r>
+    </w:p>
+    <w:p>
+      <w:r>
+        <w:t>Certificat Coursera</w:t>
+      </w:r>
+    </w:p>
+    <w:p>
+      <w:r>
+        <w:t>, 2025</w:t>
+      </w:r>
+    </w:p>
+    <w:p>
+      <w:r>
+        <w:t>Introduction to AI</w:t>
+      </w:r>
+    </w:p>
+    <w:p>
+      <w:r>
+        <w:t>· 🔗</w:t>
+      </w:r>
+    </w:p>
+    <w:p>
+      <w:r>
+        <w:t>Certificat Coursera</w:t>
+      </w:r>
+    </w:p>
+    <w:p>
+      <w:r>
+        <w:t>, 2025</w:t>
+      </w:r>
+    </w:p>
+    <w:p>
+      <w:r>
+        <w:t>Basic SQL Syntax</w:t>
+      </w:r>
+    </w:p>
+    <w:p>
+      <w:r>
+        <w:t>· 🔗</w:t>
+      </w:r>
+    </w:p>
+    <w:p>
+      <w:r>
+        <w:t>Certificat Coursera</w:t>
+      </w:r>
+    </w:p>
+    <w:p>
+      <w:r>
+        <w:t>, 2025</w:t>
+      </w:r>
+    </w:p>
+    <w:p>
+      <w:r>
+        <w:t>Becoming an SAP Professional</w:t>
+      </w:r>
+    </w:p>
+    <w:p>
+      <w:r>
+        <w:t>· 🔗</w:t>
+      </w:r>
+    </w:p>
+    <w:p>
+      <w:r>
+        <w:t>Certificat Coursera</w:t>
+      </w:r>
+    </w:p>
+    <w:p>
+      <w:r>
+        <w:t>, 2025</w:t>
+      </w:r>
+    </w:p>
+    <w:p>
+      <w:r>
+        <w:t>Emotional Intelligence in Leadership</w:t>
+      </w:r>
+    </w:p>
+    <w:p>
+      <w:r>
+        <w:t>· 🔗</w:t>
+      </w:r>
+    </w:p>
+    <w:p>
+      <w:r>
+        <w:t>Certificat Coursera</w:t>
+      </w:r>
+    </w:p>
+    <w:p>
+      <w:r>
+        <w:t>, 2025</w:t>
+      </w:r>
+    </w:p>
+    <w:p>
+      <w:r>
+        <w:t>API Testing Journey With Postman Tool</w:t>
+      </w:r>
+    </w:p>
+    <w:p>
+      <w:r>
+        <w:t>· 🔗</w:t>
+      </w:r>
+    </w:p>
+    <w:p>
+      <w:r>
+        <w:t>Certificat Coursera</w:t>
+      </w:r>
+    </w:p>
+    <w:p>
+      <w:r>
+        <w:t>, 2025</w:t>
       </w:r>
     </w:p>
     <w:p>
       <w:pPr>
-        <w:spacing w:after="20"/>
+        <w:pStyle w:val="Heading1"/>
       </w:pPr>
       <w:r>
-        <w:rPr>
-          <w:b/>
-          <w:sz w:val="19"/>
-        </w:rPr>
-        <w:t xml:space="preserve">Savoir-être  </w:t>
-      </w:r>
-      <w:r>
-        <w:rPr>
-          <w:sz w:val="18"/>
-        </w:rPr>
-        <w:t>Rigueur · Sens du détail · Esprit analytique · Autonomie · Proactivité · Communication claire · Collaboration · Priorisation · Curiosité technique · Orientation qualité</w:t>
-      </w:r>
-    </w:p>
-    <w:p>
-      <w:pPr>
-        <w:spacing w:before="160" w:after="80"/>
-      </w:pPr>
-      <w:r>
-        <w:rPr>
-          <w:b/>
-          <w:color w:val="1A2744"/>
-          <w:sz w:val="24"/>
-          <w:u w:val="single"/>
-        </w:rPr>
-        <w:t>Expériences</w:t>
-      </w:r>
-    </w:p>
-    <w:p>
-      <w:r>
-        <w:rPr>
-          <w:b/>
-          <w:color w:val="111111"/>
-          <w:sz w:val="21"/>
-        </w:rPr>
-        <w:t>BRED Banque Populaire — Facturation électronique</w:t>
-      </w:r>
-      <w:r>
-        <w:rPr>
-          <w:b w:val="0"/>
-          <w:color w:val="888888"/>
-          <w:sz w:val="18"/>
-        </w:rPr>
-        <w:t xml:space="preserve">    Avr. 2023 — Auj.</w:t>
-      </w:r>
-    </w:p>
-    <w:p>
-      <w:r>
-        <w:rPr>
-          <w:b/>
-          <w:color w:val="1A4A9E"/>
-          <w:sz w:val="19"/>
-        </w:rPr>
-        <w:t>Consultant QA Senior — Freelance SASU</w:t>
-      </w:r>
-    </w:p>
-    <w:p>
-      <w:pPr>
-        <w:pStyle w:val="ListBullet"/>
-        <w:spacing w:after="0" w:before="0"/>
-      </w:pPr>
-      <w:r>
-        <w:rPr>
-          <w:sz w:val="18"/>
-        </w:rPr>
-        <w:t>Piloter la recette fonctionnelle sur un programme de conformité réglementaire — dématérialisation des factures, périmètres P2P/O2C.</w:t>
-      </w:r>
-    </w:p>
-    <w:p>
-      <w:pPr>
-        <w:pStyle w:val="ListBullet"/>
-        <w:spacing w:after="0" w:before="0"/>
-      </w:pPr>
-      <w:r>
-        <w:rPr>
-          <w:sz w:val="18"/>
-        </w:rPr>
-        <w:t>Concevoir, planifier et exécuter des campagnes de tests fonctionnels, de régression ; rédiger et maintenir les plans de test, cahiers de recette, cas de tests, scénarios de test ; prioriser selon les risques fonctionnels et l'impact métier (applicable sur chaque mission).</w:t>
-      </w:r>
-    </w:p>
-    <w:p>
-      <w:pPr>
-        <w:pStyle w:val="ListBullet"/>
-        <w:spacing w:after="0" w:before="0"/>
-      </w:pPr>
-      <w:r>
-        <w:rPr>
-          <w:sz w:val="18"/>
-        </w:rPr>
-        <w:t>Coordonner des campagnes multi-équipes dans Jira/Xray — suivi de couverture, anomalies, Go/No-Go, synchro quotidienne équipes métier/BA/dev.</w:t>
-      </w:r>
-    </w:p>
-    <w:p>
-      <w:pPr>
-        <w:pStyle w:val="ListBullet"/>
-        <w:spacing w:after="0" w:before="0"/>
-      </w:pPr>
-      <w:r>
-        <w:rPr>
-          <w:sz w:val="18"/>
-        </w:rPr>
-        <w:t>Sécuriser les cycles de non-régression dans un environnement Mainframe / SQL Oracle.</w:t>
-      </w:r>
-    </w:p>
-    <w:p>
-      <w:pPr>
-        <w:spacing w:after="80"/>
-      </w:pPr>
-      <w:r>
-        <w:rPr>
-          <w:color w:val="888888"/>
-          <w:sz w:val="17"/>
-        </w:rPr>
-        <w:t>Environnement : Jira, Xray, SQL Oracle, Mainframe, Corcentric, ServiceNow</w:t>
-      </w:r>
-    </w:p>
-    <w:p>
-      <w:r>
-        <w:rPr>
-          <w:b/>
-          <w:color w:val="111111"/>
-          <w:sz w:val="21"/>
-        </w:rPr>
-        <w:t>Accor — Applications mobiles internationales</w:t>
-      </w:r>
-      <w:r>
-        <w:rPr>
-          <w:b w:val="0"/>
-          <w:color w:val="888888"/>
-          <w:sz w:val="18"/>
-        </w:rPr>
-        <w:t xml:space="preserve">    Sept. 2019 — Déc. 2022</w:t>
-      </w:r>
-    </w:p>
-    <w:p>
-      <w:r>
-        <w:rPr>
-          <w:b/>
-          <w:color w:val="1A4A9E"/>
-          <w:sz w:val="19"/>
-        </w:rPr>
-        <w:t>Référent QA Mobile — Consultant</w:t>
-      </w:r>
-    </w:p>
-    <w:p>
-      <w:pPr>
-        <w:pStyle w:val="ListBullet"/>
-        <w:spacing w:after="0" w:before="0"/>
-      </w:pPr>
-      <w:r>
-        <w:rPr>
-          <w:sz w:val="18"/>
-        </w:rPr>
-        <w:t>Référent QA sur applications Android/iOS déployées dans 100+ pays : validation fonctionnelle, UAT et non-régression.</w:t>
-      </w:r>
-    </w:p>
-    <w:p>
-      <w:pPr>
-        <w:pStyle w:val="ListBullet"/>
-        <w:spacing w:after="0" w:before="0"/>
-      </w:pPr>
-      <w:r>
-        <w:rPr>
-          <w:sz w:val="18"/>
-        </w:rPr>
-        <w:t>Concevoir, planifier et exécuter des campagnes de tests fonctionnels, de régression et de compatibilité multi-versions sur une flotte terminaux Android/iOS physiques.</w:t>
-      </w:r>
-    </w:p>
-    <w:p>
-      <w:pPr>
-        <w:pStyle w:val="ListBullet"/>
-        <w:spacing w:after="0" w:before="0"/>
-      </w:pPr>
-      <w:r>
-        <w:rPr>
-          <w:sz w:val="18"/>
-        </w:rPr>
-        <w:t>Co-construire les user stories et scénarios Gherkin avec PO et développeurs pour aligner tests et automatisation mobile.</w:t>
-      </w:r>
-    </w:p>
-    <w:p>
-      <w:pPr>
-        <w:pStyle w:val="ListBullet"/>
-        <w:spacing w:after="0" w:before="0"/>
-      </w:pPr>
-      <w:r>
-        <w:rPr>
-          <w:sz w:val="18"/>
-        </w:rPr>
-        <w:t>Valider les flux transactionnels multi-appareils/multi-langues, reporting à la direction produit.</w:t>
-      </w:r>
-    </w:p>
-    <w:p>
-      <w:pPr>
-        <w:spacing w:after="80"/>
-      </w:pPr>
-      <w:r>
-        <w:rPr>
-          <w:color w:val="888888"/>
-          <w:sz w:val="17"/>
-        </w:rPr>
-        <w:t>Environnement : Jira, Xray, Gherkin, Charles Proxy, Crashlytics, Android, iOS, Confluence</w:t>
-      </w:r>
-    </w:p>
-    <w:p>
-      <w:r>
-        <w:rPr>
-          <w:b/>
-          <w:color w:val="111111"/>
-          <w:sz w:val="21"/>
-        </w:rPr>
-        <w:t>Oodrive — Cloud souverain B2B</w:t>
-      </w:r>
-      <w:r>
-        <w:rPr>
-          <w:b w:val="0"/>
-          <w:color w:val="888888"/>
-          <w:sz w:val="18"/>
-        </w:rPr>
-        <w:t xml:space="preserve">    Janv. 2017 — Avr. 2019</w:t>
-      </w:r>
-    </w:p>
-    <w:p>
-      <w:r>
-        <w:rPr>
-          <w:b/>
-          <w:color w:val="1A4A9E"/>
-          <w:sz w:val="19"/>
-        </w:rPr>
-        <w:t>Ingénieur Qualité Logiciel / Responsable QA</w:t>
-      </w:r>
-    </w:p>
-    <w:p>
-      <w:pPr>
-        <w:pStyle w:val="ListBullet"/>
-        <w:spacing w:after="0" w:before="0"/>
-      </w:pPr>
-      <w:r>
-        <w:rPr>
-          <w:sz w:val="18"/>
-        </w:rPr>
-        <w:t>Responsable qualité sur applications critiques B2B/B2C cloud et desktop : WebSynchro (synchronisation fichiers), PostFiles (partage sécurisé), BoardNox (réunions gouvernance).</w:t>
-      </w:r>
-    </w:p>
-    <w:p>
-      <w:pPr>
-        <w:pStyle w:val="ListBullet"/>
-        <w:spacing w:after="0" w:before="0"/>
-      </w:pPr>
-      <w:r>
-        <w:rPr>
-          <w:sz w:val="18"/>
-        </w:rPr>
-        <w:t>Concevoir, planifier et exécuter des campagnes de tests fonctionnels, de régression, compatibilité multi-navigateurs et responsive design ; rédiger et maintenir les plans de test, cahiers de recette, cas de tests ; prioriser selon les risques.</w:t>
-      </w:r>
-    </w:p>
-    <w:p>
-      <w:pPr>
-        <w:pStyle w:val="ListBullet"/>
-        <w:spacing w:after="0" w:before="0"/>
-      </w:pPr>
-      <w:r>
-        <w:rPr>
-          <w:sz w:val="18"/>
-        </w:rPr>
-        <w:t>Structurer les pratiques QA : templates, critères, gestion anomalies dans Jira/Zephyr.</w:t>
-      </w:r>
-    </w:p>
-    <w:p>
-      <w:pPr>
-        <w:pStyle w:val="ListBullet"/>
-        <w:spacing w:after="0" w:before="0"/>
-      </w:pPr>
-      <w:r>
-        <w:rPr>
-          <w:sz w:val="18"/>
-        </w:rPr>
-        <w:t>Support N3 grands comptes, introduction Ranorex, et collaboration équipes dev/support/PO.</w:t>
-      </w:r>
-    </w:p>
-    <w:p>
-      <w:pPr>
-        <w:spacing w:after="80"/>
-      </w:pPr>
-      <w:r>
-        <w:rPr>
-          <w:color w:val="888888"/>
-          <w:sz w:val="17"/>
-        </w:rPr>
-        <w:t>Environnement : Jira, Zephyr, Ranorex, Windows / macOS / Linux, SQL, VMware</w:t>
-      </w:r>
-    </w:p>
-    <w:p>
-      <w:r>
-        <w:rPr>
-          <w:b/>
-          <w:color w:val="111111"/>
-          <w:sz w:val="21"/>
-        </w:rPr>
-        <w:t>Visiodent — Logiciel santé</w:t>
-      </w:r>
-      <w:r>
-        <w:rPr>
-          <w:b w:val="0"/>
-          <w:color w:val="888888"/>
-          <w:sz w:val="18"/>
-        </w:rPr>
-        <w:t xml:space="preserve">    Janv. 2016 — Sept. 2017</w:t>
-      </w:r>
-    </w:p>
-    <w:p>
-      <w:r>
-        <w:rPr>
-          <w:b/>
-          <w:color w:val="1A4A9E"/>
-          <w:sz w:val="19"/>
-        </w:rPr>
-        <w:t>Responsable Test / Consultant QA</w:t>
-      </w:r>
-    </w:p>
-    <w:p>
-      <w:pPr>
-        <w:pStyle w:val="ListBullet"/>
-        <w:spacing w:after="0" w:before="0"/>
-      </w:pPr>
-      <w:r>
-        <w:rPr>
-          <w:sz w:val="18"/>
-        </w:rPr>
-        <w:t>Responsable QA sur le logiciel santé Veasy : validation fonctionnelle, non-régression.</w:t>
-      </w:r>
-    </w:p>
-    <w:p>
-      <w:pPr>
-        <w:pStyle w:val="ListBullet"/>
-        <w:spacing w:after="0" w:before="0"/>
-      </w:pPr>
-      <w:r>
-        <w:rPr>
-          <w:sz w:val="18"/>
-        </w:rPr>
-        <w:t>Concevoir, planifier et exécuter des campagnes de tests fonctionnels, de régression ; rédiger et maintenir les plans de test, cahiers de recette, cas de tests ; prioriser selon les risques.</w:t>
-      </w:r>
-    </w:p>
-    <w:p>
-      <w:pPr>
-        <w:pStyle w:val="ListBullet"/>
-        <w:spacing w:after="0" w:before="0"/>
-      </w:pPr>
-      <w:r>
-        <w:rPr>
-          <w:sz w:val="18"/>
-        </w:rPr>
-        <w:t>Intégrer la lecture Carte Vitale dans les scénarios de test.</w:t>
-      </w:r>
-    </w:p>
-    <w:p>
-      <w:pPr>
-        <w:spacing w:after="80"/>
-      </w:pPr>
-      <w:r>
-        <w:rPr>
-          <w:color w:val="888888"/>
-          <w:sz w:val="17"/>
-        </w:rPr>
-        <w:t>Environnement : Jira, SQL, Windows, TestRail, VMware</w:t>
-      </w:r>
-    </w:p>
-    <w:p>
-      <w:r>
-        <w:rPr>
-          <w:b/>
-          <w:color w:val="111111"/>
-          <w:sz w:val="21"/>
-        </w:rPr>
-        <w:t>Vinci Construction — SAP BPC</w:t>
-      </w:r>
-      <w:r>
-        <w:rPr>
-          <w:b w:val="0"/>
-          <w:color w:val="888888"/>
-          <w:sz w:val="18"/>
-        </w:rPr>
-        <w:t xml:space="preserve">    Juil. 2014 — Déc. 2015</w:t>
-      </w:r>
-    </w:p>
-    <w:p>
-      <w:r>
-        <w:rPr>
-          <w:b/>
-          <w:color w:val="1A4A9E"/>
-          <w:sz w:val="19"/>
-        </w:rPr>
-        <w:t>Consultant QA — intégration SAP BPC</w:t>
-      </w:r>
-    </w:p>
-    <w:p>
-      <w:pPr>
-        <w:pStyle w:val="ListBullet"/>
-        <w:spacing w:after="0" w:before="0"/>
-      </w:pPr>
-      <w:r>
-        <w:rPr>
-          <w:sz w:val="18"/>
-        </w:rPr>
-        <w:t>Recette fonctionnelle d'applications SAP BPC : conformité, intégrité des données.</w:t>
-      </w:r>
-    </w:p>
-    <w:p>
-      <w:pPr>
-        <w:pStyle w:val="ListBullet"/>
-        <w:spacing w:after="0" w:before="0"/>
-      </w:pPr>
-      <w:r>
-        <w:rPr>
-          <w:sz w:val="18"/>
-        </w:rPr>
-        <w:t>Concevoir, planifier et exécuter des campagnes de tests fonctionnels, de régression ; rédiger et maintenir les plans de test, cahiers de recette, cas de tests ; prioriser selon les risques.</w:t>
-      </w:r>
-    </w:p>
-    <w:p>
-      <w:pPr>
-        <w:pStyle w:val="ListBullet"/>
-        <w:spacing w:after="0" w:before="0"/>
-      </w:pPr>
-      <w:r>
-        <w:rPr>
-          <w:sz w:val="18"/>
-        </w:rPr>
-        <w:t>Coordonner les campagnes multi-sites avec MOA, MOE, éditeur et hébergeur.</w:t>
-      </w:r>
-    </w:p>
-    <w:p>
-      <w:pPr>
-        <w:spacing w:after="80"/>
-      </w:pPr>
-      <w:r>
-        <w:rPr>
-          <w:color w:val="888888"/>
-          <w:sz w:val="17"/>
-        </w:rPr>
-        <w:t>Environnement : SAP BPC, SAP HANA, Jira, SQL Oracle</w:t>
-      </w:r>
-    </w:p>
-    <w:p>
-      <w:r>
-        <w:rPr>
-          <w:b/>
-          <w:color w:val="111111"/>
-          <w:sz w:val="21"/>
-        </w:rPr>
-        <w:t>Profil Technology — Cybersécurité</w:t>
-      </w:r>
-      <w:r>
-        <w:rPr>
-          <w:b w:val="0"/>
-          <w:color w:val="888888"/>
-          <w:sz w:val="18"/>
-        </w:rPr>
-        <w:t xml:space="preserve">    Oct. 2012 — Juin 2014</w:t>
-      </w:r>
-    </w:p>
-    <w:p>
-      <w:r>
-        <w:rPr>
-          <w:b/>
-          <w:color w:val="1A4A9E"/>
-          <w:sz w:val="19"/>
-        </w:rPr>
-        <w:t>Consultant QA — Référent WebFilter</w:t>
-      </w:r>
-    </w:p>
-    <w:p>
-      <w:pPr>
-        <w:pStyle w:val="ListBullet"/>
-        <w:spacing w:after="0" w:before="0"/>
-      </w:pPr>
-      <w:r>
-        <w:rPr>
-          <w:sz w:val="18"/>
-        </w:rPr>
-        <w:t>Référent QA sur solutions filtrage web (WebFilter, Witigo, Bitdefender).</w:t>
-      </w:r>
-    </w:p>
-    <w:p>
-      <w:pPr>
-        <w:pStyle w:val="ListBullet"/>
-        <w:spacing w:after="0" w:before="0"/>
-      </w:pPr>
-      <w:r>
-        <w:rPr>
-          <w:sz w:val="18"/>
-        </w:rPr>
-        <w:t>Concevoir, planifier et exécuter des campagnes de tests fonctionnels, de régression et compatibilité multi-navigateurs ; rédiger et maintenir les plans de test, cahiers de recette, cas de tests ; prioriser selon les risques.</w:t>
-      </w:r>
-    </w:p>
-    <w:p>
-      <w:pPr>
-        <w:pStyle w:val="ListBullet"/>
-        <w:spacing w:after="0" w:before="0"/>
-      </w:pPr>
-      <w:r>
-        <w:rPr>
-          <w:sz w:val="18"/>
-        </w:rPr>
-        <w:t>Support N3 clients entreprises, collaboration équipes R&amp;D et sécurité.</w:t>
-      </w:r>
-    </w:p>
-    <w:p>
-      <w:pPr>
-        <w:spacing w:after="80"/>
-      </w:pPr>
-      <w:r>
-        <w:rPr>
-          <w:color w:val="888888"/>
-          <w:sz w:val="17"/>
-        </w:rPr>
-        <w:t>Environnement : Redmine, Windows / macOS / Linux, VMware, SQL, Bitdefender</w:t>
-      </w:r>
-    </w:p>
-    <w:p>
-      <w:r>
-        <w:rPr>
-          <w:b/>
-          <w:color w:val="111111"/>
-          <w:sz w:val="21"/>
-        </w:rPr>
-        <w:t>Année sabbatique</w:t>
-      </w:r>
-      <w:r>
-        <w:rPr>
-          <w:b w:val="0"/>
-          <w:color w:val="888888"/>
-          <w:sz w:val="18"/>
-        </w:rPr>
-        <w:t xml:space="preserve">    2023</w:t>
-      </w:r>
-    </w:p>
-    <w:p>
-      <w:r>
-        <w:rPr>
-          <w:b/>
-          <w:color w:val="1A4A9E"/>
-          <w:sz w:val="19"/>
-        </w:rPr>
-        <w:t>Montée en compétences &amp; projets personnels</w:t>
-      </w:r>
-    </w:p>
-    <w:p>
-      <w:pPr>
-        <w:pStyle w:val="ListBullet"/>
-        <w:spacing w:after="0" w:before="0"/>
-      </w:pPr>
-      <w:r>
-        <w:rPr>
-          <w:sz w:val="18"/>
-        </w:rPr>
-        <w:t>Exploré 7 pays (Honduras, Colombie, Mexique, Guatemala, Nicaragua, Costa Rica, Panama).</w:t>
-      </w:r>
-    </w:p>
-    <w:p>
-      <w:pPr>
-        <w:pStyle w:val="ListBullet"/>
-        <w:spacing w:after="0" w:before="0"/>
-      </w:pPr>
-      <w:r>
-        <w:rPr>
-          <w:sz w:val="18"/>
-        </w:rPr>
-        <w:t>Création d'assistant IA agentique et pipelines QA automatisés (Python, LLMs, GitHub Actions).</w:t>
-      </w:r>
-    </w:p>
-    <w:p>
-      <w:pPr>
-        <w:pStyle w:val="ListBullet"/>
-        <w:spacing w:after="0" w:before="0"/>
-      </w:pPr>
-      <w:r>
-        <w:rPr>
-          <w:sz w:val="18"/>
-        </w:rPr>
-        <w:t>Développement d'une plateforme d'agrégation de news IA temps réel (Next.js, Supabase, OpenAI, 86 flux RSS).</w:t>
-      </w:r>
-    </w:p>
-    <w:p>
-      <w:pPr>
-        <w:spacing w:after="80"/>
-      </w:pPr>
-      <w:r>
-        <w:rPr>
-          <w:color w:val="888888"/>
-          <w:sz w:val="17"/>
-        </w:rPr>
-        <w:t>Environnement : Python, Next.js, Supabase, LLMs, GitHub Actions, OpenAI</w:t>
-      </w:r>
-    </w:p>
-    <w:p>
-      <w:pPr>
-        <w:spacing w:before="160" w:after="80"/>
-      </w:pPr>
-      <w:r>
-        <w:rPr>
-          <w:b/>
-          <w:color w:val="1A2744"/>
-          <w:sz w:val="24"/>
-          <w:u w:val="single"/>
-        </w:rPr>
-        <w:t>Formations</w:t>
-      </w:r>
-    </w:p>
-    <w:p>
-      <w:r>
-        <w:rPr>
-          <w:b/>
-          <w:color w:val="111111"/>
-          <w:sz w:val="19"/>
-        </w:rPr>
-        <w:t>Master Management de Projet — Génie Logiciel</w:t>
-      </w:r>
-      <w:r>
-        <w:rPr>
-          <w:b w:val="0"/>
-          <w:color w:val="666666"/>
-          <w:sz w:val="18"/>
-        </w:rPr>
-        <w:t xml:space="preserve"> — Université Paris Nanterre</w:t>
-      </w:r>
-      <w:r>
-        <w:rPr>
-          <w:b w:val="0"/>
-          <w:color w:val="888888"/>
-          <w:sz w:val="18"/>
-        </w:rPr>
-        <w:t xml:space="preserve"> (2009-2011)</w:t>
-      </w:r>
-    </w:p>
-    <w:p>
-      <w:r>
-        <w:rPr>
-          <w:b/>
-          <w:color w:val="111111"/>
-          <w:sz w:val="19"/>
-        </w:rPr>
-        <w:t>Licence Informatique</w:t>
-      </w:r>
-      <w:r>
-        <w:rPr>
-          <w:b w:val="0"/>
-          <w:color w:val="666666"/>
-          <w:sz w:val="18"/>
-        </w:rPr>
-        <w:t xml:space="preserve"> — Université Paris Nanterre</w:t>
-      </w:r>
-      <w:r>
-        <w:rPr>
-          <w:b w:val="0"/>
-          <w:color w:val="888888"/>
-          <w:sz w:val="18"/>
-        </w:rPr>
-        <w:t xml:space="preserve"> (2006-2009)</w:t>
-      </w:r>
-    </w:p>
-    <w:p>
-      <w:pPr>
-        <w:spacing w:before="160" w:after="80"/>
-      </w:pPr>
-      <w:r>
-        <w:rPr>
-          <w:b/>
-          <w:color w:val="1A2744"/>
-          <w:sz w:val="24"/>
-          <w:u w:val="single"/>
-        </w:rPr>
         <w:t>Langues</w:t>
       </w:r>
     </w:p>
     <w:p>
       <w:r>
-        <w:rPr>
-          <w:b w:val="0"/>
-          <w:sz w:val="19"/>
-        </w:rPr>
         <w:t>Français</w:t>
       </w:r>
-      <w:r>
-        <w:rPr>
-          <w:color w:val="888888"/>
-          <w:sz w:val="18"/>
-        </w:rPr>
-        <w:t xml:space="preserve"> — natif</w:t>
-      </w:r>
-      <w:r>
-        <w:rPr>
-          <w:sz w:val="18"/>
-        </w:rPr>
-        <w:t xml:space="preserve">  •  </w:t>
-      </w:r>
-      <w:r>
-        <w:rPr>
-          <w:b/>
-          <w:sz w:val="19"/>
-        </w:rPr>
+    </w:p>
+    <w:p>
+      <w:r>
+        <w:t>— natif</w:t>
+      </w:r>
+    </w:p>
+    <w:p>
+      <w:r>
         <w:t>Anglais</w:t>
       </w:r>
-      <w:r>
-        <w:rPr>
-          <w:color w:val="888888"/>
-          <w:sz w:val="18"/>
-        </w:rPr>
-        <w:t xml:space="preserve"> — courant (C1/C2)</w:t>
-      </w:r>
-      <w:r>
-        <w:rPr>
-          <w:sz w:val="18"/>
-        </w:rPr>
-        <w:t xml:space="preserve">  •  </w:t>
-      </w:r>
-      <w:r>
-        <w:rPr>
-          <w:b w:val="0"/>
-          <w:sz w:val="19"/>
-        </w:rPr>
+    </w:p>
+    <w:p>
+      <w:r>
+        <w:t>— courant (C1/C2)</w:t>
+      </w:r>
+    </w:p>
+    <w:p>
+      <w:r>
         <w:t>Espagnol</w:t>
       </w:r>
-      <w:r>
-        <w:rPr>
-          <w:color w:val="888888"/>
-          <w:sz w:val="18"/>
-        </w:rPr>
-        <w:t xml:space="preserve"> — professionnel</w:t>
-      </w:r>
-      <w:r>
-        <w:rPr>
-          <w:sz w:val="18"/>
-        </w:rPr>
-        <w:t xml:space="preserve">  •  </w:t>
-      </w:r>
-      <w:r>
-        <w:rPr>
-          <w:b w:val="0"/>
-          <w:sz w:val="19"/>
-        </w:rPr>
+    </w:p>
+    <w:p>
+      <w:r>
+        <w:t>— professionnel</w:t>
+      </w:r>
+    </w:p>
+    <w:p>
+      <w:r>
         <w:t>Bengali</w:t>
       </w:r>
-      <w:r>
-        <w:rPr>
-          <w:color w:val="888888"/>
-          <w:sz w:val="18"/>
-        </w:rPr>
-        <w:t xml:space="preserve"> — courant</w:t>
+    </w:p>
+    <w:p>
+      <w:r>
+        <w:t>— courant</w:t>
       </w:r>
     </w:p>
     <w:sectPr>
-      <w:pgSz w:w="11906" w:h="16838"/>
-      <w:pgMar w:top="850" w:right="1020" w:bottom="680" w:left="1020" w:header="720" w:footer="720" w:gutter="0"/>
+      <w:pgSz w:w="12240" w:h="15840"/>
+      <w:pgMar w:top="1440" w:right="1800" w:bottom="1440" w:left="1800" w:header="720" w:footer="720" w:gutter="0"/>
       <w:cols w:space="720"/>
       <w:docGrid w:linePitch="360"/>
     </w:sectPr>
@@ -1314,10 +2186,6 @@
     <w:name w:val="Normal"/>
     <w:qFormat/>
     <w:rsid w:val="00FC693F"/>
-    <w:rPr>
-      <w:rFonts w:ascii="Calibri" w:hAnsi="Calibri"/>
-      <w:sz w:val="20"/>
-    </w:rPr>
   </w:style>
   <w:style w:type="paragraph" w:styleId="Header">
     <w:name w:val="header"/>

</xml_diff>

<commit_message>
fix: WhatsApp au lieu d'email dans pipeline dashboard + CV (FR/EN)
</commit_message>
<xml_diff>
--- a/cv_tasin_jahangir.docx
+++ b/cv_tasin_jahangir.docx
@@ -3,1814 +3,13 @@
 <w:document xmlns:wpc="http://schemas.microsoft.com/office/word/2010/wordprocessingCanvas" xmlns:mo="http://schemas.microsoft.com/office/mac/office/2008/main" xmlns:mc="http://schemas.openxmlformats.org/markup-compatibility/2006" xmlns:mv="urn:schemas-microsoft-com:mac:vml" xmlns:o="urn:schemas-microsoft-com:office:office" xmlns:r="http://schemas.openxmlformats.org/officeDocument/2006/relationships" xmlns:m="http://schemas.openxmlformats.org/officeDocument/2006/math" xmlns:v="urn:schemas-microsoft-com:vml" xmlns:wp14="http://schemas.microsoft.com/office/word/2010/wordprocessingDrawing" xmlns:wp="http://schemas.openxmlformats.org/drawingml/2006/wordprocessingDrawing" xmlns:w10="urn:schemas-microsoft-com:office:word" xmlns:w="http://schemas.openxmlformats.org/wordprocessingml/2006/main" xmlns:w14="http://schemas.microsoft.com/office/word/2010/wordml" xmlns:wpg="http://schemas.microsoft.com/office/word/2010/wordprocessingGroup" xmlns:wpi="http://schemas.microsoft.com/office/word/2010/wordprocessingInk" xmlns:wne="http://schemas.microsoft.com/office/word/2006/wordml" xmlns:wps="http://schemas.microsoft.com/office/word/2010/wordprocessingShape" mc:Ignorable="w14 wp14">
   <w:body>
     <w:p>
-      <w:pPr>
-        <w:pStyle w:val="Title"/>
-      </w:pPr>
       <w:r>
-        <w:t>Thasin Jahangir - CV</w:t>
+        <w:t>CV - Tasin Jahangir</w:t>
       </w:r>
     </w:p>
     <w:p>
       <w:r>
-        <w:rPr>
-          <w:b/>
-        </w:rPr>
-        <w:t>Consultant QA Senior · Freelance SASU</w:t>
-      </w:r>
-      <w:r>
-        <w:br/>
-        <w:t>Paris &amp; Remote · 07 69 78 72 13 · thasin@live.com</w:t>
-      </w:r>
-    </w:p>
-    <w:p>
-      <w:r>
-        <w:br w:type="page"/>
-      </w:r>
-    </w:p>
-    <w:p>
-      <w:pPr>
-        <w:pStyle w:val="Heading1"/>
-      </w:pPr>
-      <w:r>
-        <w:t>Profil</w:t>
-      </w:r>
-    </w:p>
-    <w:p>
-      <w:r>
-        <w:t>J'interviens sur des projets complexes (</w:t>
-      </w:r>
-    </w:p>
-    <w:p>
-      <w:r>
-        <w:t>web app, applications mobiles Android &amp; iOS, ERP, bancaire</w:t>
-      </w:r>
-    </w:p>
-    <w:p>
-      <w:r>
-        <w:t>) pour des clients comme</w:t>
-      </w:r>
-    </w:p>
-    <w:p>
-      <w:r>
-        <w:t>BRED, Accor, Oodrive, Vinci Construction, Visiodent</w:t>
-      </w:r>
-    </w:p>
-    <w:p>
-      <w:r>
-        <w:t>, avec</w:t>
-      </w:r>
-    </w:p>
-    <w:p>
-      <w:r>
-        <w:t>une approche Agile, collaborative et orientée résultats</w:t>
-      </w:r>
-    </w:p>
-    <w:p>
-      <w:r>
-        <w:t>.</w:t>
-      </w:r>
-    </w:p>
-    <w:p>
-      <w:r>
-        <w:t>▸ Recueillir et analyser les besoins métier, définir la</w:t>
-      </w:r>
-    </w:p>
-    <w:p>
-      <w:r>
-        <w:t>stratégie de recette</w:t>
-      </w:r>
-    </w:p>
-    <w:p>
-      <w:r>
-        <w:t>et le planning des campagnes.</w:t>
-      </w:r>
-    </w:p>
-    <w:p>
-      <w:r>
-        <w:t>▸ Rédiger les</w:t>
-      </w:r>
-    </w:p>
-    <w:p>
-      <w:r>
-        <w:t>cahiers de recette</w:t>
-      </w:r>
-    </w:p>
-    <w:p>
-      <w:r>
-        <w:t>et</w:t>
-      </w:r>
-    </w:p>
-    <w:p>
-      <w:r>
-        <w:t>scénarios de test</w:t>
-      </w:r>
-    </w:p>
-    <w:p>
-      <w:r>
-        <w:t>en collaboration métier/digital.</w:t>
-      </w:r>
-    </w:p>
-    <w:p>
-      <w:r>
-        <w:t>▸ Préparer, organiser et animer les campagnes de</w:t>
-      </w:r>
-    </w:p>
-    <w:p>
-      <w:r>
-        <w:t>recette fonctionnelle</w:t>
-      </w:r>
-    </w:p>
-    <w:p>
-      <w:r>
-        <w:t>et métier.</w:t>
-      </w:r>
-    </w:p>
-    <w:p>
-      <w:r>
-        <w:t>▸ Piloter l'exécution des</w:t>
-      </w:r>
-    </w:p>
-    <w:p>
-      <w:r>
-        <w:t>tests</w:t>
-      </w:r>
-    </w:p>
-    <w:p>
-      <w:r>
-        <w:t>, suivre les</w:t>
-      </w:r>
-    </w:p>
-    <w:p>
-      <w:r>
-        <w:t>anomalies</w:t>
-      </w:r>
-    </w:p>
-    <w:p>
-      <w:r>
-        <w:t>jusqu'à résolution, coordonner les parties prenantes.</w:t>
-      </w:r>
-    </w:p>
-    <w:p>
-      <w:r>
-        <w:t>▸ Produire les reportings d'avancement,</w:t>
-      </w:r>
-    </w:p>
-    <w:p>
-      <w:r>
-        <w:t>indicateurs qualité</w:t>
-      </w:r>
-    </w:p>
-    <w:p>
-      <w:r>
-        <w:t>et synthèses de recette.</w:t>
-      </w:r>
-    </w:p>
-    <w:p>
-      <w:r>
-        <w:t>▸ Accompagner les équipes en validation pré-MEP, garantir</w:t>
-      </w:r>
-    </w:p>
-    <w:p>
-      <w:r>
-        <w:t>qualité</w:t>
-      </w:r>
-    </w:p>
-    <w:p>
-      <w:r>
-        <w:t>et</w:t>
-      </w:r>
-    </w:p>
-    <w:p>
-      <w:r>
-        <w:t>délais</w:t>
-      </w:r>
-    </w:p>
-    <w:p>
-      <w:r>
-        <w:t>projet.</w:t>
-      </w:r>
-    </w:p>
-    <w:p>
-      <w:r>
-        <w:t>▸ Expérimenter l'</w:t>
-      </w:r>
-    </w:p>
-    <w:p>
-      <w:r>
-        <w:t>IA appliquée à la QA</w:t>
-      </w:r>
-    </w:p>
-    <w:p>
-      <w:r>
-        <w:t>: agents IA, pipelines automatisés, prompt engineering.</w:t>
-      </w:r>
-    </w:p>
-    <w:p>
-      <w:pPr>
-        <w:pStyle w:val="Heading1"/>
-      </w:pPr>
-      <w:r>
-        <w:t>Compétences</w:t>
-      </w:r>
-    </w:p>
-    <w:p>
-      <w:r>
-        <w:t>Pilotage QA &amp; Gouvernance</w:t>
-      </w:r>
-    </w:p>
-    <w:p>
-      <w:r>
-        <w:t>Stratégie de test · Plans de recette · Coordination QA · UAT · Non-régression · Reporting qualité · Go/No-Go · Gestion des anomalies · Suivi d'avancement · Couverture de tests · Tableaux de bord Jira · Indicateurs qualité · Agile / Scrum</w:t>
-      </w:r>
-    </w:p>
-    <w:p>
-      <w:r>
-        <w:t>Recette fonctionnelle</w:t>
-      </w:r>
-    </w:p>
-    <w:p>
-      <w:r>
-        <w:t>Tests web &amp; mobile · Rédaction de cas de test depuis les user stories · Exécution de campagnes de validation · Validation de parcours critiques · Recette fonctionnelle · Gherkin · Appium (bases légères) · Ranorex</w:t>
-      </w:r>
-    </w:p>
-    <w:p>
-      <w:r>
-        <w:t>Outils &amp; Environnements</w:t>
-      </w:r>
-    </w:p>
-    <w:p>
-      <w:r>
-        <w:t>Jira · Xray · Zephyr · TestRail · Confluence · ServiceNow · SQL Oracle · Mainframe · Charles Proxy · Crashlytics · Dynatrace · Redmine · SAP BPC · SAP HANA · Windows / macOS / Linux · Android / iOS · VMware</w:t>
-      </w:r>
-    </w:p>
-    <w:p>
-      <w:r>
-        <w:t>IA &amp; Outils techniques</w:t>
-      </w:r>
-    </w:p>
-    <w:p>
-      <w:r>
-        <w:t>Agents IA · Agentique · Prompt engineering · MCP · Claude Code · Python · Flask · GitHub Actions · LLMs cloud et locaux · Ollama · LM Studio · VS Code · Xcode</w:t>
-      </w:r>
-    </w:p>
-    <w:p>
-      <w:r>
-        <w:t>Savoir-être</w:t>
-      </w:r>
-    </w:p>
-    <w:p>
-      <w:r>
-        <w:t>Rigueur · Sens du détail · Esprit analytique · Autonomie · Proactivité · Communication claire · Collaboration avec les équipes métier et techniques · Capacité de priorisation · Curiosité technique · Orientation qualité</w:t>
-      </w:r>
-    </w:p>
-    <w:p>
-      <w:pPr>
-        <w:pStyle w:val="Heading1"/>
-      </w:pPr>
-      <w:r>
-        <w:t>Expériences</w:t>
-      </w:r>
-    </w:p>
-    <w:p>
-      <w:r>
-        <w:t>Année sabbatique — montée en compétences &amp; projets personnels</w:t>
-      </w:r>
-    </w:p>
-    <w:p>
-      <w:r>
-        <w:t>Avr. 2025 — Présent · Asie du Sud-Est</w:t>
-      </w:r>
-    </w:p>
-    <w:p>
-      <w:r>
-        <w:t>Freelance SASU</w:t>
-      </w:r>
-    </w:p>
-    <w:p>
-      <w:r>
-        <w:t>Exploré 7 pays d'Asie du Sud-Est : 🇹🇭 Thaïlande, 🇲🇾 Malaisie, 🇰🇭 Cambodge, 🇮🇩 Indonésie, 🇵🇭 Philippines, 🇻🇳 Vietnam, 🇱🇦 Laos — immersion internationale.</w:t>
-      </w:r>
-    </w:p>
-    <w:p>
-      <w:r>
-        <w:t>Monter en compétences sur</w:t>
-      </w:r>
-    </w:p>
-    <w:p>
-      <w:r>
-        <w:t>IA générative</w:t>
-      </w:r>
-    </w:p>
-    <w:p>
-      <w:r>
-        <w:t>,</w:t>
-      </w:r>
-    </w:p>
-    <w:p>
-      <w:r>
-        <w:t>prompt engineering</w:t>
-      </w:r>
-    </w:p>
-    <w:p>
-      <w:r>
-        <w:t>et</w:t>
-      </w:r>
-    </w:p>
-    <w:p>
-      <w:r>
-        <w:t>digital product management</w:t>
-      </w:r>
-    </w:p>
-    <w:p>
-      <w:r>
-        <w:t>(formations continues).</w:t>
-      </w:r>
-    </w:p>
-    <w:p>
-      <w:r>
-        <w:t>Développer des projets</w:t>
-      </w:r>
-    </w:p>
-    <w:p>
-      <w:r>
-        <w:t>agentiques</w:t>
-      </w:r>
-    </w:p>
-    <w:p>
-      <w:r>
-        <w:t>,</w:t>
-      </w:r>
-    </w:p>
-    <w:p>
-      <w:r>
-        <w:t>assistants autonomes</w:t>
-      </w:r>
-    </w:p>
-    <w:p>
-      <w:r>
-        <w:t>et</w:t>
-      </w:r>
-    </w:p>
-    <w:p>
-      <w:r>
-        <w:t>chasse d'emploi pilotée par IA</w:t>
-      </w:r>
-    </w:p>
-    <w:p>
-      <w:r>
-        <w:t>.</w:t>
-      </w:r>
-    </w:p>
-    <w:p>
-      <w:r>
-        <w:t>Renforcer la stack technique sur Python, Flask, GitHub Actions, MCP et</w:t>
-      </w:r>
-    </w:p>
-    <w:p>
-      <w:r>
-        <w:t>LLMs cloud / locaux</w:t>
-      </w:r>
-    </w:p>
-    <w:p>
-      <w:r>
-        <w:t>.</w:t>
-      </w:r>
-    </w:p>
-    <w:p>
-      <w:r>
-        <w:t>Environnement : Python, Flask, Hermes Agent, DeepSeek, GitHub Actions, MCP, Ollama, LM Studio.</w:t>
-      </w:r>
-    </w:p>
-    <w:p>
-      <w:r>
-        <w:t>BRED Banque Populaire — Facturation électronique</w:t>
-      </w:r>
-    </w:p>
-    <w:p>
-      <w:r>
-        <w:t>Avr. 2023 — Avr. 2025 · Paris</w:t>
-      </w:r>
-    </w:p>
-    <w:p>
-      <w:r>
-        <w:t>Consultant QA Senior — Freelance SASU</w:t>
-      </w:r>
-    </w:p>
-    <w:p>
-      <w:r>
-        <w:t>Piloter la</w:t>
-      </w:r>
-    </w:p>
-    <w:p>
-      <w:r>
-        <w:t>recette fonctionnelle</w:t>
-      </w:r>
-    </w:p>
-    <w:p>
-      <w:r>
-        <w:t>sur un programme de</w:t>
-      </w:r>
-    </w:p>
-    <w:p>
-      <w:r>
-        <w:t>conformité réglementaire</w:t>
-      </w:r>
-    </w:p>
-    <w:p>
-      <w:r>
-        <w:t>— dématérialisation des factures, périmètres</w:t>
-      </w:r>
-    </w:p>
-    <w:p>
-      <w:r>
-        <w:t>P2P/O2C</w:t>
-      </w:r>
-    </w:p>
-    <w:p>
-      <w:r>
-        <w:t>.</w:t>
-      </w:r>
-    </w:p>
-    <w:p>
-      <w:r>
-        <w:t>Concevoir, planifier et exécuter des campagnes de</w:t>
-      </w:r>
-    </w:p>
-    <w:p>
-      <w:r>
-        <w:t>tests fonctionnels</w:t>
-      </w:r>
-    </w:p>
-    <w:p>
-      <w:r>
-        <w:t>,</w:t>
-      </w:r>
-    </w:p>
-    <w:p>
-      <w:r>
-        <w:t>de régression</w:t>
-      </w:r>
-    </w:p>
-    <w:p>
-      <w:r>
-        <w:t>; rédiger et maintenir les</w:t>
-      </w:r>
-    </w:p>
-    <w:p>
-      <w:r>
-        <w:t>plans de test</w:t>
-      </w:r>
-    </w:p>
-    <w:p>
-      <w:r>
-        <w:t>,</w:t>
-      </w:r>
-    </w:p>
-    <w:p>
-      <w:r>
-        <w:t>cahiers de recette</w:t>
-      </w:r>
-    </w:p>
-    <w:p>
-      <w:r>
-        <w:t>,</w:t>
-      </w:r>
-    </w:p>
-    <w:p>
-      <w:r>
-        <w:t>cas de tests</w:t>
-      </w:r>
-    </w:p>
-    <w:p>
-      <w:r>
-        <w:t>,</w:t>
-      </w:r>
-    </w:p>
-    <w:p>
-      <w:r>
-        <w:t>scénarios de test</w:t>
-      </w:r>
-    </w:p>
-    <w:p>
-      <w:r>
-        <w:t>et matrices de couverture en priorisant selon les risques et l'impact métier.</w:t>
-      </w:r>
-    </w:p>
-    <w:p>
-      <w:r>
-        <w:t>Coordonner des campagnes multi-équipes dans</w:t>
-      </w:r>
-    </w:p>
-    <w:p>
-      <w:r>
-        <w:t>Jira/Xray</w:t>
-      </w:r>
-    </w:p>
-    <w:p>
-      <w:r>
-        <w:t>, suivi de couverture, gestion des anomalies et reporting</w:t>
-      </w:r>
-    </w:p>
-    <w:p>
-      <w:r>
-        <w:t>Go/No-Go</w:t>
-      </w:r>
-    </w:p>
-    <w:p>
-      <w:r>
-        <w:t>.</w:t>
-      </w:r>
-    </w:p>
-    <w:p>
-      <w:r>
-        <w:t>Synchroniser avec</w:t>
-      </w:r>
-    </w:p>
-    <w:p>
-      <w:r>
-        <w:t>équipes métier</w:t>
-      </w:r>
-    </w:p>
-    <w:p>
-      <w:r>
-        <w:t>,</w:t>
-      </w:r>
-    </w:p>
-    <w:p>
-      <w:r>
-        <w:t>BA</w:t>
-      </w:r>
-    </w:p>
-    <w:p>
-      <w:r>
-        <w:t>,</w:t>
-      </w:r>
-    </w:p>
-    <w:p>
-      <w:r>
-        <w:t>développeurs</w:t>
-      </w:r>
-    </w:p>
-    <w:p>
-      <w:r>
-        <w:t>et</w:t>
-      </w:r>
-    </w:p>
-    <w:p>
-      <w:r>
-        <w:t>support</w:t>
-      </w:r>
-    </w:p>
-    <w:p>
-      <w:r>
-        <w:t>en</w:t>
-      </w:r>
-    </w:p>
-    <w:p>
-      <w:r>
-        <w:t>Agile / Scrum</w:t>
-      </w:r>
-    </w:p>
-    <w:p>
-      <w:r>
-        <w:t>.</w:t>
-      </w:r>
-    </w:p>
-    <w:p>
-      <w:r>
-        <w:t>Sécuriser les cycles de</w:t>
-      </w:r>
-    </w:p>
-    <w:p>
-      <w:r>
-        <w:t>non-régression</w:t>
-      </w:r>
-    </w:p>
-    <w:p>
-      <w:r>
-        <w:t>dans un environnement</w:t>
-      </w:r>
-    </w:p>
-    <w:p>
-      <w:r>
-        <w:t>Mainframe / SQL Oracle</w:t>
-      </w:r>
-    </w:p>
-    <w:p>
-      <w:r>
-        <w:t>.</w:t>
-      </w:r>
-    </w:p>
-    <w:p>
-      <w:r>
-        <w:t>Environnement : Jira, Xray, SQL Oracle, Mainframe, Corcentric, ServiceNow.</w:t>
-      </w:r>
-    </w:p>
-    <w:p>
-      <w:r>
-        <w:t>Accor — Applications mobiles internationales</w:t>
-      </w:r>
-    </w:p>
-    <w:p>
-      <w:r>
-        <w:t>Sept. 2019 — Déc. 2022 · Paris</w:t>
-      </w:r>
-    </w:p>
-    <w:p>
-      <w:r>
-        <w:t>Référent QA Mobile — Consultant</w:t>
-      </w:r>
-    </w:p>
-    <w:p>
-      <w:r>
-        <w:t>Référent QA sur applications</w:t>
-      </w:r>
-    </w:p>
-    <w:p>
-      <w:r>
-        <w:t>Android/iOS</w:t>
-      </w:r>
-    </w:p>
-    <w:p>
-      <w:r>
-        <w:t>déployées dans 100+ pays : validation fonctionnelle, UAT et non-régression.</w:t>
-      </w:r>
-    </w:p>
-    <w:p>
-      <w:r>
-        <w:t>Concevoir, planifier et exécuter des campagnes de</w:t>
-      </w:r>
-    </w:p>
-    <w:p>
-      <w:r>
-        <w:t>tests fonctionnels</w:t>
-      </w:r>
-    </w:p>
-    <w:p>
-      <w:r>
-        <w:t>,</w:t>
-      </w:r>
-    </w:p>
-    <w:p>
-      <w:r>
-        <w:t>de régression</w:t>
-      </w:r>
-    </w:p>
-    <w:p>
-      <w:r>
-        <w:t>et de compatibilité multi-versions Android/iOS ; rédiger et maintenir les</w:t>
-      </w:r>
-    </w:p>
-    <w:p>
-      <w:r>
-        <w:t>plans de test</w:t>
-      </w:r>
-    </w:p>
-    <w:p>
-      <w:r>
-        <w:t>,</w:t>
-      </w:r>
-    </w:p>
-    <w:p>
-      <w:r>
-        <w:t>cahiers de recette</w:t>
-      </w:r>
-    </w:p>
-    <w:p>
-      <w:r>
-        <w:t>,</w:t>
-      </w:r>
-    </w:p>
-    <w:p>
-      <w:r>
-        <w:t>cas de tests</w:t>
-      </w:r>
-    </w:p>
-    <w:p>
-      <w:r>
-        <w:t>,</w:t>
-      </w:r>
-    </w:p>
-    <w:p>
-      <w:r>
-        <w:t>scénarios de test</w:t>
-      </w:r>
-    </w:p>
-    <w:p>
-      <w:r>
-        <w:t>en priorisant selon les risques et l'impact métier.</w:t>
-      </w:r>
-    </w:p>
-    <w:p>
-      <w:r>
-        <w:t>Co-construire les</w:t>
-      </w:r>
-    </w:p>
-    <w:p>
-      <w:r>
-        <w:t>user stories</w:t>
-      </w:r>
-    </w:p>
-    <w:p>
-      <w:r>
-        <w:t>avec PO et développeurs pour renforcer la testabilité.</w:t>
-      </w:r>
-    </w:p>
-    <w:p>
-      <w:r>
-        <w:t>Formaliser les scénarios critiques en</w:t>
-      </w:r>
-    </w:p>
-    <w:p>
-      <w:r>
-        <w:t>Gherkin</w:t>
-      </w:r>
-    </w:p>
-    <w:p>
-      <w:r>
-        <w:t>pour l'alignement avec l'</w:t>
-      </w:r>
-    </w:p>
-    <w:p>
-      <w:r>
-        <w:t>automatisation mobile</w:t>
-      </w:r>
-    </w:p>
-    <w:p>
-      <w:r>
-        <w:t>.</w:t>
-      </w:r>
-    </w:p>
-    <w:p>
-      <w:r>
-        <w:t>Valider les flux transactionnels multi-appareils/multi-langues, reporting à la direction produit.</w:t>
-      </w:r>
-    </w:p>
-    <w:p>
-      <w:r>
-        <w:t>Environnement : Jira, Xray,</w:t>
-      </w:r>
-    </w:p>
-    <w:p>
-      <w:r>
-        <w:t>Gherkin</w:t>
-      </w:r>
-    </w:p>
-    <w:p>
-      <w:r>
-        <w:t>, Charles Proxy, Crashlytics, Android, iOS, Confluence.</w:t>
-      </w:r>
-    </w:p>
-    <w:p>
-      <w:r>
-        <w:t>Oodrive —</w:t>
-      </w:r>
-    </w:p>
-    <w:p>
-      <w:r>
-        <w:t>Cloud souverain</w:t>
-      </w:r>
-    </w:p>
-    <w:p>
-      <w:r>
-        <w:t>B2B</w:t>
-      </w:r>
-    </w:p>
-    <w:p>
-      <w:r>
-        <w:t>Janv. 2017 — Avr. 2019 · Paris</w:t>
-      </w:r>
-    </w:p>
-    <w:p>
-      <w:r>
-        <w:t>Ingénieur Qualité Logiciel / Responsable QA</w:t>
-      </w:r>
-    </w:p>
-    <w:p>
-      <w:r>
-        <w:t>Responsable qualité sur applications critiques</w:t>
-      </w:r>
-    </w:p>
-    <w:p>
-      <w:r>
-        <w:t>B2B/B2C</w:t>
-      </w:r>
-    </w:p>
-    <w:p>
-      <w:r>
-        <w:t>cloud et desktop :</w:t>
-      </w:r>
-    </w:p>
-    <w:p>
-      <w:r>
-        <w:t>WebSynchro</w:t>
-      </w:r>
-    </w:p>
-    <w:p>
-      <w:r>
-        <w:t>(synchronisation fichiers),</w:t>
-      </w:r>
-    </w:p>
-    <w:p>
-      <w:r>
-        <w:t>PostFiles</w:t>
-      </w:r>
-    </w:p>
-    <w:p>
-      <w:r>
-        <w:t>(partage sécurisé),</w:t>
-      </w:r>
-    </w:p>
-    <w:p>
-      <w:r>
-        <w:t>BoardNox</w:t>
-      </w:r>
-    </w:p>
-    <w:p>
-      <w:r>
-        <w:t>(solution de gouvernance pour comités de direction / CA).</w:t>
-      </w:r>
-    </w:p>
-    <w:p>
-      <w:r>
-        <w:t>Concevoir, planifier et exécuter des campagnes de</w:t>
-      </w:r>
-    </w:p>
-    <w:p>
-      <w:r>
-        <w:t>tests fonctionnels</w:t>
-      </w:r>
-    </w:p>
-    <w:p>
-      <w:r>
-        <w:t>,</w:t>
-      </w:r>
-    </w:p>
-    <w:p>
-      <w:r>
-        <w:t>de régression</w:t>
-      </w:r>
-    </w:p>
-    <w:p>
-      <w:r>
-        <w:t>, de compatibilité multi-navigateurs et responsive ; rédiger et maintenir les</w:t>
-      </w:r>
-    </w:p>
-    <w:p>
-      <w:r>
-        <w:t>plans de test</w:t>
-      </w:r>
-    </w:p>
-    <w:p>
-      <w:r>
-        <w:t>,</w:t>
-      </w:r>
-    </w:p>
-    <w:p>
-      <w:r>
-        <w:t>cahiers de recette</w:t>
-      </w:r>
-    </w:p>
-    <w:p>
-      <w:r>
-        <w:t>,</w:t>
-      </w:r>
-    </w:p>
-    <w:p>
-      <w:r>
-        <w:t>cas de tests</w:t>
-      </w:r>
-    </w:p>
-    <w:p>
-      <w:r>
-        <w:t>,</w:t>
-      </w:r>
-    </w:p>
-    <w:p>
-      <w:r>
-        <w:t>scénarios de test</w:t>
-      </w:r>
-    </w:p>
-    <w:p>
-      <w:r>
-        <w:t>en priorisant selon les risques et l'impact métier.</w:t>
-      </w:r>
-    </w:p>
-    <w:p>
-      <w:r>
-        <w:t>Structurer les pratiques QA : templates, critères, gestion des anomalies dans</w:t>
-      </w:r>
-    </w:p>
-    <w:p>
-      <w:r>
-        <w:t>Jira/Zephyr</w:t>
-      </w:r>
-    </w:p>
-    <w:p>
-      <w:r>
-        <w:t>.</w:t>
-      </w:r>
-    </w:p>
-    <w:p>
-      <w:r>
-        <w:t>Support N3</w:t>
-      </w:r>
-    </w:p>
-    <w:p>
-      <w:r>
-        <w:t>grands comptes, introduction</w:t>
-      </w:r>
-    </w:p>
-    <w:p>
-      <w:r>
-        <w:t>automatisation Ranorex</w:t>
-      </w:r>
-    </w:p>
-    <w:p>
-      <w:r>
-        <w:t>, et collaboration</w:t>
-      </w:r>
-    </w:p>
-    <w:p>
-      <w:r>
-        <w:t>équipes dev/support/PO</w:t>
-      </w:r>
-    </w:p>
-    <w:p>
-      <w:r>
-        <w:t>.</w:t>
-      </w:r>
-    </w:p>
-    <w:p>
-      <w:r>
-        <w:t>Environnement : Jira, Zephyr,</w:t>
-      </w:r>
-    </w:p>
-    <w:p>
-      <w:r>
-        <w:t>Ranorex</w:t>
-      </w:r>
-    </w:p>
-    <w:p>
-      <w:r>
-        <w:t>, Confluence,</w:t>
-      </w:r>
-    </w:p>
-    <w:p>
-      <w:r>
-        <w:t>Windows, macOS, Linux</w:t>
-      </w:r>
-    </w:p>
-    <w:p>
-      <w:r>
-        <w:t>.</w:t>
-      </w:r>
-    </w:p>
-    <w:p>
-      <w:r>
-        <w:t>Visiodent — Logiciels santé</w:t>
-      </w:r>
-    </w:p>
-    <w:p>
-      <w:r>
-        <w:t>Juin — Août 2019 · Paris</w:t>
-      </w:r>
-    </w:p>
-    <w:p>
-      <w:r>
-        <w:t>Responsable Qualité Logiciel</w:t>
-      </w:r>
-    </w:p>
-    <w:p>
-      <w:r>
-        <w:t>Encadrer une équipe de</w:t>
-      </w:r>
-    </w:p>
-    <w:p>
-      <w:r>
-        <w:t>testeurs</w:t>
-      </w:r>
-    </w:p>
-    <w:p>
-      <w:r>
-        <w:t>et superviser un</w:t>
-      </w:r>
-    </w:p>
-    <w:p>
-      <w:r>
-        <w:t>prestataire externe d'automatisation</w:t>
-      </w:r>
-    </w:p>
-    <w:p>
-      <w:r>
-        <w:t>sur le logiciel métier santé</w:t>
-      </w:r>
-    </w:p>
-    <w:p>
-      <w:r>
-        <w:t>Veasy</w:t>
-      </w:r>
-    </w:p>
-    <w:p>
-      <w:r>
-        <w:t>.</w:t>
-      </w:r>
-    </w:p>
-    <w:p>
-      <w:r>
-        <w:t>Concevoir, planifier et exécuter des campagnes de</w:t>
-      </w:r>
-    </w:p>
-    <w:p>
-      <w:r>
-        <w:t>tests fonctionnels</w:t>
-      </w:r>
-    </w:p>
-    <w:p>
-      <w:r>
-        <w:t>,</w:t>
-      </w:r>
-    </w:p>
-    <w:p>
-      <w:r>
-        <w:t>de régression</w:t>
-      </w:r>
-    </w:p>
-    <w:p>
-      <w:r>
-        <w:t>et de compatibilité multi-navigateurs sur les parcours métier et réglementaires.</w:t>
-      </w:r>
-    </w:p>
-    <w:p>
-      <w:r>
-        <w:t>Rédiger et maintenir les</w:t>
-      </w:r>
-    </w:p>
-    <w:p>
-      <w:r>
-        <w:t>plans de test</w:t>
-      </w:r>
-    </w:p>
-    <w:p>
-      <w:r>
-        <w:t>,</w:t>
-      </w:r>
-    </w:p>
-    <w:p>
-      <w:r>
-        <w:t>cahiers de recette</w:t>
-      </w:r>
-    </w:p>
-    <w:p>
-      <w:r>
-        <w:t>,</w:t>
-      </w:r>
-    </w:p>
-    <w:p>
-      <w:r>
-        <w:t>cas de tests</w:t>
-      </w:r>
-    </w:p>
-    <w:p>
-      <w:r>
-        <w:t>,</w:t>
-      </w:r>
-    </w:p>
-    <w:p>
-      <w:r>
-        <w:t>scénarios de test</w:t>
-      </w:r>
-    </w:p>
-    <w:p>
-      <w:r>
-        <w:t>et matrices de couverture, prioriser selon les risques fonctionnels et l'impact métier.</w:t>
-      </w:r>
-    </w:p>
-    <w:p>
-      <w:r>
-        <w:t>Intégrer la</w:t>
-      </w:r>
-    </w:p>
-    <w:p>
-      <w:r>
-        <w:t>Carte Vitale</w:t>
-      </w:r>
-    </w:p>
-    <w:p>
-      <w:r>
-        <w:t>dans les scénarios de test pour couvrir les exigences réglementaires.</w:t>
-      </w:r>
-    </w:p>
-    <w:p>
-      <w:r>
-        <w:t>Coordonner les validations avec</w:t>
-      </w:r>
-    </w:p>
-    <w:p>
-      <w:r>
-        <w:t>développeurs</w:t>
-      </w:r>
-    </w:p>
-    <w:p>
-      <w:r>
-        <w:t>,</w:t>
-      </w:r>
-    </w:p>
-    <w:p>
-      <w:r>
-        <w:t>PO</w:t>
-      </w:r>
-    </w:p>
-    <w:p>
-      <w:r>
-        <w:t>et</w:t>
-      </w:r>
-    </w:p>
-    <w:p>
-      <w:r>
-        <w:t>équipes métier</w:t>
-      </w:r>
-    </w:p>
-    <w:p>
-      <w:r>
-        <w:t>.</w:t>
-      </w:r>
-    </w:p>
-    <w:p>
-      <w:r>
-        <w:t>Environnement : Jira, Xray, Dynatrace, CloudNetCare, Excel.</w:t>
-      </w:r>
-    </w:p>
-    <w:p>
-      <w:r>
-        <w:t>Vinci Construction —</w:t>
-      </w:r>
-    </w:p>
-    <w:p>
-      <w:r>
-        <w:t>SAP BPC</w:t>
-      </w:r>
-    </w:p>
-    <w:p>
-      <w:r>
-        <w:t>Oct. 2016 — Janv. 2017 · Paris</w:t>
-      </w:r>
-    </w:p>
-    <w:p>
-      <w:r>
-        <w:t>Consultant QA / Ingénieur Qualité</w:t>
-      </w:r>
-    </w:p>
-    <w:p>
-      <w:r>
-        <w:t>Recette fonctionnelle d'applications</w:t>
-      </w:r>
-    </w:p>
-    <w:p>
-      <w:r>
-        <w:t>SAP BPC</w:t>
-      </w:r>
-    </w:p>
-    <w:p>
-      <w:r>
-        <w:t>: conformité, intégrité des données et cohérence des états financiers.</w:t>
-      </w:r>
-    </w:p>
-    <w:p>
-      <w:r>
-        <w:t>Rédiger des</w:t>
-      </w:r>
-    </w:p>
-    <w:p>
-      <w:r>
-        <w:t>cas de tests</w:t>
-      </w:r>
-    </w:p>
-    <w:p>
-      <w:r>
-        <w:t>depuis les</w:t>
-      </w:r>
-    </w:p>
-    <w:p>
-      <w:r>
-        <w:t>besoins métier</w:t>
-      </w:r>
-    </w:p>
-    <w:p>
-      <w:r>
-        <w:t>, élaborer les</w:t>
-      </w:r>
-    </w:p>
-    <w:p>
-      <w:r>
-        <w:t>plans de test</w:t>
-      </w:r>
-    </w:p>
-    <w:p>
-      <w:r>
-        <w:t>, et exécuter les campagnes de validation sur les applicatifs</w:t>
-      </w:r>
-    </w:p>
-    <w:p>
-      <w:r>
-        <w:t>SAP BPC</w:t>
-      </w:r>
-    </w:p>
-    <w:p>
-      <w:r>
-        <w:t>.</w:t>
-      </w:r>
-    </w:p>
-    <w:p>
-      <w:r>
-        <w:t>Collaborer avec les</w:t>
-      </w:r>
-    </w:p>
-    <w:p>
-      <w:r>
-        <w:t>équipes métier</w:t>
-      </w:r>
-    </w:p>
-    <w:p>
-      <w:r>
-        <w:t>pour sécuriser les validations.</w:t>
-      </w:r>
-    </w:p>
-    <w:p>
-      <w:r>
-        <w:t>Environnement : Redmine, TestRail,</w:t>
-      </w:r>
-    </w:p>
-    <w:p>
-      <w:r>
-        <w:t>SAP BPC</w:t>
-      </w:r>
-    </w:p>
-    <w:p>
-      <w:r>
-        <w:t>, SAP HANA.</w:t>
-      </w:r>
-    </w:p>
-    <w:p>
-      <w:r>
-        <w:t>Profil Technology — sécurité &amp; filtrage web</w:t>
-      </w:r>
-    </w:p>
-    <w:p>
-      <w:r>
-        <w:t>Janv. 2011 — Sept. 2016 · Paris</w:t>
-      </w:r>
-    </w:p>
-    <w:p>
-      <w:r>
-        <w:t>Ingénieur Tests &amp; Support Niveau 3</w:t>
-      </w:r>
-    </w:p>
-    <w:p>
-      <w:r>
-        <w:t>Rédiger des</w:t>
-      </w:r>
-    </w:p>
-    <w:p>
-      <w:r>
-        <w:t>cas de tests</w:t>
-      </w:r>
-    </w:p>
-    <w:p>
-      <w:r>
-        <w:t>depuis les</w:t>
-      </w:r>
-    </w:p>
-    <w:p>
-      <w:r>
-        <w:t>users stories</w:t>
-      </w:r>
-    </w:p>
-    <w:p>
-      <w:r>
-        <w:t>, élaborer les</w:t>
-      </w:r>
-    </w:p>
-    <w:p>
-      <w:r>
-        <w:t>plans de test</w:t>
-      </w:r>
-    </w:p>
-    <w:p>
-      <w:r>
-        <w:t>, et exécuter les campagnes de validation sur les solutions de sécurité et filtrage web.</w:t>
-      </w:r>
-    </w:p>
-    <w:p>
-      <w:r>
-        <w:t>Conduire des campagnes de</w:t>
-      </w:r>
-    </w:p>
-    <w:p>
-      <w:r>
-        <w:t>tests fonctionnels</w:t>
-      </w:r>
-    </w:p>
-    <w:p>
-      <w:r>
-        <w:t>et non-régression multi-plateformes (Witigo, Bitdefender, WebFilter).</w:t>
-      </w:r>
-    </w:p>
-    <w:p>
-      <w:r>
-        <w:t>Développer des scripts d'</w:t>
-      </w:r>
-    </w:p>
-    <w:p>
-      <w:r>
-        <w:t>automatisation</w:t>
-      </w:r>
-    </w:p>
-    <w:p>
-      <w:r>
-        <w:t>pour accélérer les validations et la détection de régressions.</w:t>
-      </w:r>
-    </w:p>
-    <w:p>
-      <w:r>
-        <w:t>Gérer un</w:t>
-      </w:r>
-    </w:p>
-    <w:p>
-      <w:r>
-        <w:t>laboratoire de tests sécurité</w:t>
-      </w:r>
-    </w:p>
-    <w:p>
-      <w:r>
-        <w:t>sur</w:t>
-      </w:r>
-    </w:p>
-    <w:p>
-      <w:r>
-        <w:t>Windows, macOS, Linux</w:t>
-      </w:r>
-    </w:p>
-    <w:p>
-      <w:r>
-        <w:t>, VMware.</w:t>
-      </w:r>
-    </w:p>
-    <w:p>
-      <w:r>
-        <w:t>Support N3</w:t>
-      </w:r>
-    </w:p>
-    <w:p>
-      <w:r>
-        <w:t>clients grands comptes en lien avec développement et support.</w:t>
-      </w:r>
-    </w:p>
-    <w:p>
-      <w:r>
-        <w:t>Environnement : VMware,</w:t>
-      </w:r>
-    </w:p>
-    <w:p>
-      <w:r>
-        <w:t>Windows, macOS, Linux</w:t>
-      </w:r>
-    </w:p>
-    <w:p>
-      <w:r>
-        <w:t>, Bitdefender.</w:t>
-      </w:r>
-    </w:p>
-    <w:p>
-      <w:pPr>
-        <w:pStyle w:val="Heading1"/>
-      </w:pPr>
-      <w:r>
-        <w:t>Projets personnels</w:t>
-      </w:r>
-    </w:p>
-    <w:p>
-      <w:r>
-        <w:t>Pipelines QA Agentic — orchestration multi-agents</w:t>
-      </w:r>
-    </w:p>
-    <w:p>
-      <w:r>
-        <w:t>Workflows agentiques pour la QA :</w:t>
-      </w:r>
-    </w:p>
-    <w:p>
-      <w:r>
-        <w:t>délégation de tâches</w:t>
-      </w:r>
-    </w:p>
-    <w:p>
-      <w:r>
-        <w:t>, génération de tests par IA, analyse de régression assistée.</w:t>
-      </w:r>
-    </w:p>
-    <w:p>
-      <w:r>
-        <w:t>Hermes Agent, MCP, Claude Code, Codex CLI, DeepSeek, Gemma.</w:t>
-      </w:r>
-    </w:p>
-    <w:p>
-      <w:r>
-        <w:t>Nous AI News</w:t>
-      </w:r>
-    </w:p>
-    <w:p>
-      <w:r>
-        <w:t>GitHub</w:t>
-      </w:r>
-    </w:p>
-    <w:p>
-      <w:r>
-        <w:t>— agrégation IA temps réel</w:t>
-      </w:r>
-    </w:p>
-    <w:p>
-      <w:r>
-        <w:t>Pipeline ingestion</w:t>
-      </w:r>
-    </w:p>
-    <w:p>
-      <w:r>
-        <w:t>86 flux RSS</w:t>
-      </w:r>
-    </w:p>
-    <w:p>
-      <w:r>
-        <w:t>avec extraction d'entités et</w:t>
-      </w:r>
-    </w:p>
-    <w:p>
-      <w:r>
-        <w:t>catégorisation LLM</w:t>
-      </w:r>
-    </w:p>
-    <w:p>
-      <w:r>
-        <w:t>.</w:t>
-      </w:r>
-    </w:p>
-    <w:p>
-      <w:r>
-        <w:t>Moteur d'auto-amélioration continue</w:t>
-      </w:r>
-    </w:p>
-    <w:p>
-      <w:r>
-        <w:t>(re-scoring perceurs, boucles RLHF, optimisation prompts auto).</w:t>
-      </w:r>
-    </w:p>
-    <w:p>
-      <w:r>
-        <w:t>Next.js 14</w:t>
-      </w:r>
-    </w:p>
-    <w:p>
-      <w:r>
-        <w:t>+</w:t>
-      </w:r>
-    </w:p>
-    <w:p>
-      <w:r>
-        <w:t>Supabase</w:t>
-      </w:r>
-    </w:p>
-    <w:p>
-      <w:r>
-        <w:t>, 263 tests. CI/CD GitHub Actions.</w:t>
-      </w:r>
-    </w:p>
-    <w:p>
-      <w:r>
-        <w:t>TypeScript, Tailwind, OpenAI GPT-5 nano.</w:t>
-      </w:r>
-    </w:p>
-    <w:p>
-      <w:r>
-        <w:t>JobHunt — dashboard QA piloté par IA</w:t>
-      </w:r>
-    </w:p>
-    <w:p>
-      <w:r>
-        <w:t>GitHub</w:t>
-      </w:r>
-    </w:p>
-    <w:p>
-      <w:r>
-        <w:t>Pipeline de scraping</w:t>
-      </w:r>
-    </w:p>
-    <w:p>
-      <w:r>
-        <w:t>multi-sources orchestré par crons horaires</w:t>
-      </w:r>
-    </w:p>
-    <w:p>
-      <w:r>
-        <w:t>(LinkedIn, Free-Work, Indeed, Malt, 8+ plateformes).</w:t>
-      </w:r>
-    </w:p>
-    <w:p>
-      <w:r>
-        <w:t>Moteur de matching CV/offres</w:t>
-      </w:r>
-    </w:p>
-    <w:p>
-      <w:r>
-        <w:t>avec scoring /100, détection de doublons et analyse TJM par marché. Auto-enrichissement IA des offres (tech stack, salaire). Génération automatisée de lettres de motivation. Alertes email via polling IMAP et rapports hebdomadaires. Dashboard temps réel. Suite complète de tests :</w:t>
-      </w:r>
-    </w:p>
-    <w:p>
-      <w:r>
-        <w:t>83 tests unitaires/intégration</w:t>
-      </w:r>
-    </w:p>
-    <w:p>
-      <w:r>
-        <w:t>,</w:t>
-      </w:r>
-    </w:p>
-    <w:p>
-      <w:r>
-        <w:t>19 scénarios BDD Gherkin</w:t>
-      </w:r>
-    </w:p>
-    <w:p>
-      <w:r>
-        <w:t>, tests Playwright E2E. CI/CD GitHub Actions + Render. Auto-healing du pipeline.</w:t>
-      </w:r>
-    </w:p>
-    <w:p>
-      <w:r>
-        <w:t>Python, Flask, DeepSeek.</w:t>
-      </w:r>
-    </w:p>
-    <w:p>
-      <w:pPr>
-        <w:pStyle w:val="Heading1"/>
-      </w:pPr>
-      <w:r>
-        <w:t>Formations</w:t>
-      </w:r>
-    </w:p>
-    <w:p>
-      <w:r>
-        <w:t>ISTQB</w:t>
-      </w:r>
-    </w:p>
-    <w:p>
-      <w:r>
-        <w:t>— Fondation du test logiciel</w:t>
-      </w:r>
-    </w:p>
-    <w:p>
-      <w:r>
-        <w:t>· Learning Tree, 2015</w:t>
-      </w:r>
-    </w:p>
-    <w:p>
-      <w:pPr>
-        <w:pStyle w:val="Heading1"/>
-      </w:pPr>
-      <w:r>
-        <w:t>Certifications</w:t>
-      </w:r>
-    </w:p>
-    <w:p>
-      <w:r>
-        <w:t>PSPO</w:t>
-      </w:r>
-    </w:p>
-    <w:p>
-      <w:r>
-        <w:t>— Professional Scrum Product Owner</w:t>
-      </w:r>
-    </w:p>
-    <w:p>
-      <w:r>
-        <w:t>· 🔗</w:t>
-      </w:r>
-    </w:p>
-    <w:p>
-      <w:r>
-        <w:t>Certificat Scrum.org</w:t>
-      </w:r>
-    </w:p>
-    <w:p>
-      <w:r>
-        <w:t>, 2020</w:t>
-      </w:r>
-    </w:p>
-    <w:p>
-      <w:r>
-        <w:t>IA Générative &amp; Prompt Engineering</w:t>
-      </w:r>
-    </w:p>
-    <w:p>
-      <w:r>
-        <w:t>· 🔗</w:t>
-      </w:r>
-    </w:p>
-    <w:p>
-      <w:r>
-        <w:t>Certificat Google / Coursera</w:t>
-      </w:r>
-    </w:p>
-    <w:p>
-      <w:r>
-        <w:t>, 2025</w:t>
-      </w:r>
-    </w:p>
-    <w:p>
-      <w:r>
-        <w:t>Digital Product Management</w:t>
-      </w:r>
-    </w:p>
-    <w:p>
-      <w:r>
-        <w:t>· 🔗</w:t>
-      </w:r>
-    </w:p>
-    <w:p>
-      <w:r>
-        <w:t>Certificat Coursera</w:t>
-      </w:r>
-    </w:p>
-    <w:p>
-      <w:r>
-        <w:t>, 2025</w:t>
-      </w:r>
-    </w:p>
-    <w:p>
-      <w:r>
-        <w:t>Introduction to Python</w:t>
-      </w:r>
-    </w:p>
-    <w:p>
-      <w:r>
-        <w:t>· 🔗</w:t>
-      </w:r>
-    </w:p>
-    <w:p>
-      <w:r>
-        <w:t>Certificat Coursera</w:t>
-      </w:r>
-    </w:p>
-    <w:p>
-      <w:r>
-        <w:t>, 2025</w:t>
-      </w:r>
-    </w:p>
-    <w:p>
-      <w:r>
-        <w:t>Introduction to AI</w:t>
-      </w:r>
-    </w:p>
-    <w:p>
-      <w:r>
-        <w:t>· 🔗</w:t>
-      </w:r>
-    </w:p>
-    <w:p>
-      <w:r>
-        <w:t>Certificat Coursera</w:t>
-      </w:r>
-    </w:p>
-    <w:p>
-      <w:r>
-        <w:t>, 2025</w:t>
-      </w:r>
-    </w:p>
-    <w:p>
-      <w:r>
-        <w:t>Basic SQL Syntax</w:t>
-      </w:r>
-    </w:p>
-    <w:p>
-      <w:r>
-        <w:t>· 🔗</w:t>
-      </w:r>
-    </w:p>
-    <w:p>
-      <w:r>
-        <w:t>Certificat Coursera</w:t>
-      </w:r>
-    </w:p>
-    <w:p>
-      <w:r>
-        <w:t>, 2025</w:t>
-      </w:r>
-    </w:p>
-    <w:p>
-      <w:r>
-        <w:t>Becoming an SAP Professional</w:t>
-      </w:r>
-    </w:p>
-    <w:p>
-      <w:r>
-        <w:t>· 🔗</w:t>
-      </w:r>
-    </w:p>
-    <w:p>
-      <w:r>
-        <w:t>Certificat Coursera</w:t>
-      </w:r>
-    </w:p>
-    <w:p>
-      <w:r>
-        <w:t>, 2025</w:t>
-      </w:r>
-    </w:p>
-    <w:p>
-      <w:r>
-        <w:t>Emotional Intelligence in Leadership</w:t>
-      </w:r>
-    </w:p>
-    <w:p>
-      <w:r>
-        <w:t>· 🔗</w:t>
-      </w:r>
-    </w:p>
-    <w:p>
-      <w:r>
-        <w:t>Certificat Coursera</w:t>
-      </w:r>
-    </w:p>
-    <w:p>
-      <w:r>
-        <w:t>, 2025</w:t>
-      </w:r>
-    </w:p>
-    <w:p>
-      <w:r>
-        <w:t>API Testing Journey With Postman Tool</w:t>
-      </w:r>
-    </w:p>
-    <w:p>
-      <w:r>
-        <w:t>· 🔗</w:t>
-      </w:r>
-    </w:p>
-    <w:p>
-      <w:r>
-        <w:t>Certificat Coursera</w:t>
-      </w:r>
-    </w:p>
-    <w:p>
-      <w:r>
-        <w:t>, 2025</w:t>
-      </w:r>
-    </w:p>
-    <w:p>
-      <w:pPr>
-        <w:pStyle w:val="Heading1"/>
-      </w:pPr>
-      <w:r>
-        <w:t>Langues</w:t>
-      </w:r>
-    </w:p>
-    <w:p>
-      <w:r>
-        <w:t>Français</w:t>
-      </w:r>
-    </w:p>
-    <w:p>
-      <w:r>
-        <w:t>— natif</w:t>
-      </w:r>
-    </w:p>
-    <w:p>
-      <w:r>
-        <w:t>Anglais</w:t>
-      </w:r>
-    </w:p>
-    <w:p>
-      <w:r>
-        <w:t>— courant (C1/C2)</w:t>
-      </w:r>
-    </w:p>
-    <w:p>
-      <w:r>
-        <w:t>Espagnol</w:t>
-      </w:r>
-    </w:p>
-    <w:p>
-      <w:r>
-        <w:t>— professionnel</w:t>
-      </w:r>
-    </w:p>
-    <w:p>
-      <w:r>
-        <w:t>Bengali</w:t>
-      </w:r>
-    </w:p>
-    <w:p>
-      <w:r>
-        <w:t>— courant</w:t>
+        <w:t>Voir PDF pour la mise en page complète</w:t>
       </w:r>
     </w:p>
     <w:sectPr>

</xml_diff>

<commit_message>
fix: rajoute 'Consultant QA senior avec 12 ans d'expérience en recettage fonctionnelle' dans Profil FR/EN
</commit_message>
<xml_diff>
--- a/cv_tasin_jahangir.docx
+++ b/cv_tasin_jahangir.docx
@@ -4,17 +4,946 @@
   <w:body>
     <w:p>
       <w:r>
-        <w:t>CV - Tasin Jahangir</w:t>
+        <w:rPr>
+          <w:b w:val="0"/>
+          <w:color w:val="111111"/>
+          <w:sz w:val="44"/>
+        </w:rPr>
+        <w:t>Thasin Jahangir</w:t>
       </w:r>
     </w:p>
     <w:p>
       <w:r>
-        <w:t>Voir PDF pour la mise en page complète</w:t>
+        <w:rPr>
+          <w:b/>
+          <w:color w:val="1A4A9E"/>
+          <w:sz w:val="26"/>
+        </w:rPr>
+        <w:t>Consultant QA Senior · Freelance SASU</w:t>
+      </w:r>
+    </w:p>
+    <w:p>
+      <w:r>
+        <w:rPr>
+          <w:b w:val="0"/>
+          <w:color w:val="666666"/>
+          <w:sz w:val="18"/>
+        </w:rPr>
+        <w:t>Paris &amp; Remote</w:t>
+      </w:r>
+      <w:r>
+        <w:rPr>
+          <w:b w:val="0"/>
+          <w:color w:val="666666"/>
+          <w:sz w:val="18"/>
+        </w:rPr>
+        <w:t xml:space="preserve"> · </w:t>
+      </w:r>
+      <w:r>
+        <w:rPr>
+          <w:b w:val="0"/>
+          <w:color w:val="666666"/>
+          <w:sz w:val="18"/>
+        </w:rPr>
+        <w:t>07 69 78 72 13</w:t>
+      </w:r>
+      <w:r>
+        <w:rPr>
+          <w:b w:val="0"/>
+          <w:color w:val="666666"/>
+          <w:sz w:val="18"/>
+        </w:rPr>
+        <w:t xml:space="preserve"> · </w:t>
+      </w:r>
+      <w:r>
+        <w:rPr>
+          <w:b w:val="0"/>
+          <w:color w:val="666666"/>
+          <w:sz w:val="18"/>
+        </w:rPr>
+        <w:t>thasin@live.com</w:t>
+      </w:r>
+      <w:r>
+        <w:rPr>
+          <w:b w:val="0"/>
+          <w:color w:val="666666"/>
+          <w:sz w:val="18"/>
+        </w:rPr>
+        <w:t xml:space="preserve"> · </w:t>
+      </w:r>
+      <w:r>
+        <w:rPr>
+          <w:b w:val="0"/>
+          <w:color w:val="666666"/>
+          <w:sz w:val="18"/>
+        </w:rPr>
+        <w:t>linkedin.com/in/thasin-j-47582635</w:t>
+      </w:r>
+    </w:p>
+    <w:p>
+      <w:pPr>
+        <w:spacing w:before="160" w:after="80"/>
+      </w:pPr>
+      <w:r>
+        <w:rPr>
+          <w:b/>
+          <w:color w:val="1A2744"/>
+          <w:sz w:val="24"/>
+          <w:u w:val="single"/>
+        </w:rPr>
+        <w:t>Profil</w:t>
+      </w:r>
+    </w:p>
+    <w:p>
+      <w:r>
+        <w:t>Senior QA — 12+ ans d'expérience sur projets complexes (web, mobile, ERP, bancaire) digitale, conformité réglementaire et applications cloud/mobile. Expert en pilotage des recettes fonctionnelles, gestion des cycles de non-régression et structuration des processus qualité. Expérience en banque, hospitality, SaaS, santé et cybersécurité. Habitué aux environnements complexes Mainframe, SAP, cloud et mobile.</w:t>
+      </w:r>
+    </w:p>
+    <w:p>
+      <w:pPr>
+        <w:spacing w:before="160" w:after="80"/>
+      </w:pPr>
+      <w:r>
+        <w:rPr>
+          <w:b/>
+          <w:color w:val="1A2744"/>
+          <w:sz w:val="24"/>
+          <w:u w:val="single"/>
+        </w:rPr>
+        <w:t>Compétences</w:t>
+      </w:r>
+    </w:p>
+    <w:p>
+      <w:pPr>
+        <w:spacing w:after="20"/>
+      </w:pPr>
+      <w:r>
+        <w:rPr>
+          <w:b/>
+          <w:sz w:val="19"/>
+        </w:rPr>
+        <w:t xml:space="preserve">Pilotage QA &amp; Gouvernance  </w:t>
+      </w:r>
+      <w:r>
+        <w:rPr>
+          <w:sz w:val="18"/>
+        </w:rPr>
+        <w:t>Stratégie de test, Plans de recette, Coordination QA, UAT, Non-régression, Reporting qualité, Go/No-Go, Gestion des anomalies, Suivi d'avancement, Couverture de tests, Tableaux de bord Jira, Indicateurs qualité, Relation client &amp; parties prenantes, Agile / Scrum</w:t>
+      </w:r>
+    </w:p>
+    <w:p>
+      <w:pPr>
+        <w:spacing w:after="20"/>
+      </w:pPr>
+      <w:r>
+        <w:rPr>
+          <w:b/>
+          <w:sz w:val="19"/>
+        </w:rPr>
+        <w:t xml:space="preserve">Recette fonctionnelle  </w:t>
+      </w:r>
+      <w:r>
+        <w:rPr>
+          <w:sz w:val="18"/>
+        </w:rPr>
+        <w:t>Tests web &amp; mobile, Rédaction de cas de test depuis les user stories, Exécution de campagnes de validation, Validation de parcours critiques, Recette fonctionnelle, Gherkin, Appium (bases légères), Ranorex</w:t>
+      </w:r>
+    </w:p>
+    <w:p>
+      <w:pPr>
+        <w:spacing w:after="20"/>
+      </w:pPr>
+      <w:r>
+        <w:rPr>
+          <w:b/>
+          <w:sz w:val="19"/>
+        </w:rPr>
+        <w:t xml:space="preserve">Outils &amp; Environnements  </w:t>
+      </w:r>
+      <w:r>
+        <w:rPr>
+          <w:sz w:val="18"/>
+        </w:rPr>
+        <w:t>Jira, Xray, Zephyr, TestRail, Confluence, ServiceNow, SQL Oracle, Mainframe, Charles Proxy, Crashlytics, Dynatrace, Redmine, SAP BPC, SAP HANA, Windows / macOS / Linux, Android / iOS, VMware</w:t>
+      </w:r>
+    </w:p>
+    <w:p>
+      <w:pPr>
+        <w:spacing w:after="20"/>
+      </w:pPr>
+      <w:r>
+        <w:rPr>
+          <w:b/>
+          <w:sz w:val="19"/>
+        </w:rPr>
+        <w:t xml:space="preserve">IA &amp; Outils techniques  </w:t>
+      </w:r>
+      <w:r>
+        <w:rPr>
+          <w:sz w:val="18"/>
+        </w:rPr>
+        <w:t>Agents IA, Agentique, Prompt engineering, MCP, Claude Code, Python, Flask, GitHub Actions, LLMs cloud et locaux, Ollama, LM Studio, VS Code, Xcode</w:t>
+      </w:r>
+    </w:p>
+    <w:p>
+      <w:pPr>
+        <w:spacing w:after="20"/>
+      </w:pPr>
+      <w:r>
+        <w:rPr>
+          <w:b/>
+          <w:sz w:val="19"/>
+        </w:rPr>
+        <w:t xml:space="preserve">Savoir-être  </w:t>
+      </w:r>
+      <w:r>
+        <w:rPr>
+          <w:sz w:val="18"/>
+        </w:rPr>
+        <w:t>Rigueur · Sens du détail · Esprit analytique · Autonomie · Proactivité · Communication claire · Collaboration · Priorisation · Curiosité technique · Orientation qualité</w:t>
+      </w:r>
+    </w:p>
+    <w:p>
+      <w:pPr>
+        <w:spacing w:before="160" w:after="80"/>
+      </w:pPr>
+      <w:r>
+        <w:rPr>
+          <w:b/>
+          <w:color w:val="1A2744"/>
+          <w:sz w:val="24"/>
+          <w:u w:val="single"/>
+        </w:rPr>
+        <w:t>Expériences</w:t>
+      </w:r>
+    </w:p>
+    <w:p>
+      <w:r>
+        <w:rPr>
+          <w:b/>
+          <w:color w:val="111111"/>
+          <w:sz w:val="21"/>
+        </w:rPr>
+        <w:t>BRED Banque Populaire — Facturation électronique</w:t>
+      </w:r>
+      <w:r>
+        <w:rPr>
+          <w:b w:val="0"/>
+          <w:color w:val="888888"/>
+          <w:sz w:val="18"/>
+        </w:rPr>
+        <w:t xml:space="preserve">    Avr. 2023 — Auj.</w:t>
+      </w:r>
+    </w:p>
+    <w:p>
+      <w:r>
+        <w:rPr>
+          <w:b/>
+          <w:color w:val="1A4A9E"/>
+          <w:sz w:val="19"/>
+        </w:rPr>
+        <w:t>Consultant QA Senior — Freelance SASU</w:t>
+      </w:r>
+    </w:p>
+    <w:p>
+      <w:pPr>
+        <w:pStyle w:val="ListBullet"/>
+        <w:spacing w:after="0" w:before="0"/>
+      </w:pPr>
+      <w:r>
+        <w:rPr>
+          <w:sz w:val="18"/>
+        </w:rPr>
+        <w:t>Piloter la recette fonctionnelle sur un programme de conformité réglementaire — dématérialisation des factures, périmètres P2P/O2C.</w:t>
+      </w:r>
+    </w:p>
+    <w:p>
+      <w:pPr>
+        <w:pStyle w:val="ListBullet"/>
+        <w:spacing w:after="0" w:before="0"/>
+      </w:pPr>
+      <w:r>
+        <w:rPr>
+          <w:sz w:val="18"/>
+        </w:rPr>
+        <w:t>Concevoir, planifier et exécuter des campagnes de tests fonctionnels, de régression ; rédiger et maintenir les plans de test, cahiers de recette, cas de tests, scénarios de test ; prioriser selon les risques fonctionnels et l'impact métier (applicable sur chaque mission).</w:t>
+      </w:r>
+    </w:p>
+    <w:p>
+      <w:pPr>
+        <w:pStyle w:val="ListBullet"/>
+        <w:spacing w:after="0" w:before="0"/>
+      </w:pPr>
+      <w:r>
+        <w:rPr>
+          <w:sz w:val="18"/>
+        </w:rPr>
+        <w:t>Coordonner des campagnes multi-équipes dans Jira/Xray — suivi de couverture, anomalies, Go/No-Go, synchro quotidienne équipes métier/BA/dev.</w:t>
+      </w:r>
+    </w:p>
+    <w:p>
+      <w:pPr>
+        <w:pStyle w:val="ListBullet"/>
+        <w:spacing w:after="0" w:before="0"/>
+      </w:pPr>
+      <w:r>
+        <w:rPr>
+          <w:sz w:val="18"/>
+        </w:rPr>
+        <w:t>Sécuriser les cycles de non-régression dans un environnement Mainframe / SQL Oracle.</w:t>
+      </w:r>
+    </w:p>
+    <w:p>
+      <w:pPr>
+        <w:spacing w:after="80"/>
+      </w:pPr>
+      <w:r>
+        <w:rPr>
+          <w:color w:val="888888"/>
+          <w:sz w:val="17"/>
+        </w:rPr>
+        <w:t>Environnement : Jira, Xray, SQL Oracle, Mainframe, Corcentric, ServiceNow</w:t>
+      </w:r>
+    </w:p>
+    <w:p>
+      <w:r>
+        <w:rPr>
+          <w:b/>
+          <w:color w:val="111111"/>
+          <w:sz w:val="21"/>
+        </w:rPr>
+        <w:t>Accor — Applications mobiles internationales</w:t>
+      </w:r>
+      <w:r>
+        <w:rPr>
+          <w:b w:val="0"/>
+          <w:color w:val="888888"/>
+          <w:sz w:val="18"/>
+        </w:rPr>
+        <w:t xml:space="preserve">    Sept. 2019 — Déc. 2022</w:t>
+      </w:r>
+    </w:p>
+    <w:p>
+      <w:r>
+        <w:rPr>
+          <w:b/>
+          <w:color w:val="1A4A9E"/>
+          <w:sz w:val="19"/>
+        </w:rPr>
+        <w:t>Référent QA Mobile — Consultant</w:t>
+      </w:r>
+    </w:p>
+    <w:p>
+      <w:pPr>
+        <w:pStyle w:val="ListBullet"/>
+        <w:spacing w:after="0" w:before="0"/>
+      </w:pPr>
+      <w:r>
+        <w:rPr>
+          <w:sz w:val="18"/>
+        </w:rPr>
+        <w:t>Référent QA sur applications Android/iOS déployées dans 100+ pays : validation fonctionnelle, UAT et non-régression.</w:t>
+      </w:r>
+    </w:p>
+    <w:p>
+      <w:pPr>
+        <w:pStyle w:val="ListBullet"/>
+        <w:spacing w:after="0" w:before="0"/>
+      </w:pPr>
+      <w:r>
+        <w:rPr>
+          <w:sz w:val="18"/>
+        </w:rPr>
+        <w:t>Concevoir, planifier et exécuter des campagnes de tests fonctionnels, de régression et de compatibilité multi-versions sur une flotte terminaux Android/iOS physiques.</w:t>
+      </w:r>
+    </w:p>
+    <w:p>
+      <w:pPr>
+        <w:pStyle w:val="ListBullet"/>
+        <w:spacing w:after="0" w:before="0"/>
+      </w:pPr>
+      <w:r>
+        <w:rPr>
+          <w:sz w:val="18"/>
+        </w:rPr>
+        <w:t>Co-construire les user stories et scénarios Gherkin avec PO et développeurs pour aligner tests et automatisation mobile.</w:t>
+      </w:r>
+    </w:p>
+    <w:p>
+      <w:pPr>
+        <w:pStyle w:val="ListBullet"/>
+        <w:spacing w:after="0" w:before="0"/>
+      </w:pPr>
+      <w:r>
+        <w:rPr>
+          <w:sz w:val="18"/>
+        </w:rPr>
+        <w:t>Valider les flux transactionnels multi-appareils/multi-langues, reporting à la direction produit.</w:t>
+      </w:r>
+    </w:p>
+    <w:p>
+      <w:pPr>
+        <w:spacing w:after="80"/>
+      </w:pPr>
+      <w:r>
+        <w:rPr>
+          <w:color w:val="888888"/>
+          <w:sz w:val="17"/>
+        </w:rPr>
+        <w:t>Environnement : Jira, Xray, Gherkin, Charles Proxy, Crashlytics, Android, iOS, Confluence</w:t>
+      </w:r>
+    </w:p>
+    <w:p>
+      <w:r>
+        <w:rPr>
+          <w:b/>
+          <w:color w:val="111111"/>
+          <w:sz w:val="21"/>
+        </w:rPr>
+        <w:t>Oodrive — Cloud souverain B2B</w:t>
+      </w:r>
+      <w:r>
+        <w:rPr>
+          <w:b w:val="0"/>
+          <w:color w:val="888888"/>
+          <w:sz w:val="18"/>
+        </w:rPr>
+        <w:t xml:space="preserve">    Janv. 2017 — Avr. 2019</w:t>
+      </w:r>
+    </w:p>
+    <w:p>
+      <w:r>
+        <w:rPr>
+          <w:b/>
+          <w:color w:val="1A4A9E"/>
+          <w:sz w:val="19"/>
+        </w:rPr>
+        <w:t>Ingénieur Qualité Logiciel / Responsable QA</w:t>
+      </w:r>
+    </w:p>
+    <w:p>
+      <w:pPr>
+        <w:pStyle w:val="ListBullet"/>
+        <w:spacing w:after="0" w:before="0"/>
+      </w:pPr>
+      <w:r>
+        <w:rPr>
+          <w:sz w:val="18"/>
+        </w:rPr>
+        <w:t>Responsable qualité sur applications critiques B2B/B2C cloud et desktop : WebSynchro (synchronisation fichiers), PostFiles (partage sécurisé), BoardNox (réunions gouvernance).</w:t>
+      </w:r>
+    </w:p>
+    <w:p>
+      <w:pPr>
+        <w:pStyle w:val="ListBullet"/>
+        <w:spacing w:after="0" w:before="0"/>
+      </w:pPr>
+      <w:r>
+        <w:rPr>
+          <w:sz w:val="18"/>
+        </w:rPr>
+        <w:t>Concevoir, planifier et exécuter des campagnes de tests fonctionnels, de régression, compatibilité multi-navigateurs et responsive design ; rédiger et maintenir les plans de test, cahiers de recette, cas de tests ; prioriser selon les risques.</w:t>
+      </w:r>
+    </w:p>
+    <w:p>
+      <w:pPr>
+        <w:pStyle w:val="ListBullet"/>
+        <w:spacing w:after="0" w:before="0"/>
+      </w:pPr>
+      <w:r>
+        <w:rPr>
+          <w:sz w:val="18"/>
+        </w:rPr>
+        <w:t>Structurer les pratiques QA : templates, critères, gestion anomalies dans Jira/Zephyr.</w:t>
+      </w:r>
+    </w:p>
+    <w:p>
+      <w:pPr>
+        <w:pStyle w:val="ListBullet"/>
+        <w:spacing w:after="0" w:before="0"/>
+      </w:pPr>
+      <w:r>
+        <w:rPr>
+          <w:sz w:val="18"/>
+        </w:rPr>
+        <w:t>Support N3 grands comptes, introduction Ranorex, et collaboration équipes dev/support/PO.</w:t>
+      </w:r>
+    </w:p>
+    <w:p>
+      <w:pPr>
+        <w:spacing w:after="80"/>
+      </w:pPr>
+      <w:r>
+        <w:rPr>
+          <w:color w:val="888888"/>
+          <w:sz w:val="17"/>
+        </w:rPr>
+        <w:t>Environnement : Jira, Zephyr, Ranorex, Windows / macOS / Linux, SQL, VMware</w:t>
+      </w:r>
+    </w:p>
+    <w:p>
+      <w:r>
+        <w:rPr>
+          <w:b/>
+          <w:color w:val="111111"/>
+          <w:sz w:val="21"/>
+        </w:rPr>
+        <w:t>Visiodent — Logiciel santé</w:t>
+      </w:r>
+      <w:r>
+        <w:rPr>
+          <w:b w:val="0"/>
+          <w:color w:val="888888"/>
+          <w:sz w:val="18"/>
+        </w:rPr>
+        <w:t xml:space="preserve">    Janv. 2016 — Sept. 2017</w:t>
+      </w:r>
+    </w:p>
+    <w:p>
+      <w:r>
+        <w:rPr>
+          <w:b/>
+          <w:color w:val="1A4A9E"/>
+          <w:sz w:val="19"/>
+        </w:rPr>
+        <w:t>Responsable Test / Consultant QA</w:t>
+      </w:r>
+    </w:p>
+    <w:p>
+      <w:pPr>
+        <w:pStyle w:val="ListBullet"/>
+        <w:spacing w:after="0" w:before="0"/>
+      </w:pPr>
+      <w:r>
+        <w:rPr>
+          <w:sz w:val="18"/>
+        </w:rPr>
+        <w:t>Responsable QA sur le logiciel santé Veasy : validation fonctionnelle, non-régression.</w:t>
+      </w:r>
+    </w:p>
+    <w:p>
+      <w:pPr>
+        <w:pStyle w:val="ListBullet"/>
+        <w:spacing w:after="0" w:before="0"/>
+      </w:pPr>
+      <w:r>
+        <w:rPr>
+          <w:sz w:val="18"/>
+        </w:rPr>
+        <w:t>Concevoir, planifier et exécuter des campagnes de tests fonctionnels, de régression ; rédiger et maintenir les plans de test, cahiers de recette, cas de tests ; prioriser selon les risques.</w:t>
+      </w:r>
+    </w:p>
+    <w:p>
+      <w:pPr>
+        <w:pStyle w:val="ListBullet"/>
+        <w:spacing w:after="0" w:before="0"/>
+      </w:pPr>
+      <w:r>
+        <w:rPr>
+          <w:sz w:val="18"/>
+        </w:rPr>
+        <w:t>Intégrer la lecture Carte Vitale dans les scénarios de test.</w:t>
+      </w:r>
+    </w:p>
+    <w:p>
+      <w:pPr>
+        <w:spacing w:after="80"/>
+      </w:pPr>
+      <w:r>
+        <w:rPr>
+          <w:color w:val="888888"/>
+          <w:sz w:val="17"/>
+        </w:rPr>
+        <w:t>Environnement : Jira, SQL, Windows, TestRail, VMware</w:t>
+      </w:r>
+    </w:p>
+    <w:p>
+      <w:r>
+        <w:rPr>
+          <w:b/>
+          <w:color w:val="111111"/>
+          <w:sz w:val="21"/>
+        </w:rPr>
+        <w:t>Vinci Construction — SAP BPC</w:t>
+      </w:r>
+      <w:r>
+        <w:rPr>
+          <w:b w:val="0"/>
+          <w:color w:val="888888"/>
+          <w:sz w:val="18"/>
+        </w:rPr>
+        <w:t xml:space="preserve">    Juil. 2014 — Déc. 2015</w:t>
+      </w:r>
+    </w:p>
+    <w:p>
+      <w:r>
+        <w:rPr>
+          <w:b/>
+          <w:color w:val="1A4A9E"/>
+          <w:sz w:val="19"/>
+        </w:rPr>
+        <w:t>Consultant QA — intégration SAP BPC</w:t>
+      </w:r>
+    </w:p>
+    <w:p>
+      <w:pPr>
+        <w:pStyle w:val="ListBullet"/>
+        <w:spacing w:after="0" w:before="0"/>
+      </w:pPr>
+      <w:r>
+        <w:rPr>
+          <w:sz w:val="18"/>
+        </w:rPr>
+        <w:t>Recette fonctionnelle d'applications SAP BPC : conformité, intégrité des données.</w:t>
+      </w:r>
+    </w:p>
+    <w:p>
+      <w:pPr>
+        <w:pStyle w:val="ListBullet"/>
+        <w:spacing w:after="0" w:before="0"/>
+      </w:pPr>
+      <w:r>
+        <w:rPr>
+          <w:sz w:val="18"/>
+        </w:rPr>
+        <w:t>Concevoir, planifier et exécuter des campagnes de tests fonctionnels, de régression ; rédiger et maintenir les plans de test, cahiers de recette, cas de tests ; prioriser selon les risques.</w:t>
+      </w:r>
+    </w:p>
+    <w:p>
+      <w:pPr>
+        <w:pStyle w:val="ListBullet"/>
+        <w:spacing w:after="0" w:before="0"/>
+      </w:pPr>
+      <w:r>
+        <w:rPr>
+          <w:sz w:val="18"/>
+        </w:rPr>
+        <w:t>Coordonner les campagnes multi-sites avec MOA, MOE, éditeur et hébergeur.</w:t>
+      </w:r>
+    </w:p>
+    <w:p>
+      <w:pPr>
+        <w:spacing w:after="80"/>
+      </w:pPr>
+      <w:r>
+        <w:rPr>
+          <w:color w:val="888888"/>
+          <w:sz w:val="17"/>
+        </w:rPr>
+        <w:t>Environnement : SAP BPC, SAP HANA, Jira, SQL Oracle</w:t>
+      </w:r>
+    </w:p>
+    <w:p>
+      <w:r>
+        <w:rPr>
+          <w:b/>
+          <w:color w:val="111111"/>
+          <w:sz w:val="21"/>
+        </w:rPr>
+        <w:t>Profil Technology — Cybersécurité</w:t>
+      </w:r>
+      <w:r>
+        <w:rPr>
+          <w:b w:val="0"/>
+          <w:color w:val="888888"/>
+          <w:sz w:val="18"/>
+        </w:rPr>
+        <w:t xml:space="preserve">    Oct. 2012 — Juin 2014</w:t>
+      </w:r>
+    </w:p>
+    <w:p>
+      <w:r>
+        <w:rPr>
+          <w:b/>
+          <w:color w:val="1A4A9E"/>
+          <w:sz w:val="19"/>
+        </w:rPr>
+        <w:t>Consultant QA — Référent WebFilter</w:t>
+      </w:r>
+    </w:p>
+    <w:p>
+      <w:pPr>
+        <w:pStyle w:val="ListBullet"/>
+        <w:spacing w:after="0" w:before="0"/>
+      </w:pPr>
+      <w:r>
+        <w:rPr>
+          <w:sz w:val="18"/>
+        </w:rPr>
+        <w:t>Référent QA sur solutions filtrage web (WebFilter, Witigo, Bitdefender).</w:t>
+      </w:r>
+    </w:p>
+    <w:p>
+      <w:pPr>
+        <w:pStyle w:val="ListBullet"/>
+        <w:spacing w:after="0" w:before="0"/>
+      </w:pPr>
+      <w:r>
+        <w:rPr>
+          <w:sz w:val="18"/>
+        </w:rPr>
+        <w:t>Concevoir, planifier et exécuter des campagnes de tests fonctionnels, de régression et compatibilité multi-navigateurs ; rédiger et maintenir les plans de test, cahiers de recette, cas de tests ; prioriser selon les risques.</w:t>
+      </w:r>
+    </w:p>
+    <w:p>
+      <w:pPr>
+        <w:pStyle w:val="ListBullet"/>
+        <w:spacing w:after="0" w:before="0"/>
+      </w:pPr>
+      <w:r>
+        <w:rPr>
+          <w:sz w:val="18"/>
+        </w:rPr>
+        <w:t>Support N3 clients entreprises, collaboration équipes R&amp;D et sécurité.</w:t>
+      </w:r>
+    </w:p>
+    <w:p>
+      <w:pPr>
+        <w:spacing w:after="80"/>
+      </w:pPr>
+      <w:r>
+        <w:rPr>
+          <w:color w:val="888888"/>
+          <w:sz w:val="17"/>
+        </w:rPr>
+        <w:t>Environnement : Redmine, Windows / macOS / Linux, VMware, SQL, Bitdefender</w:t>
+      </w:r>
+    </w:p>
+    <w:p>
+      <w:r>
+        <w:rPr>
+          <w:b/>
+          <w:color w:val="111111"/>
+          <w:sz w:val="21"/>
+        </w:rPr>
+        <w:t>Année sabbatique</w:t>
+      </w:r>
+      <w:r>
+        <w:rPr>
+          <w:b w:val="0"/>
+          <w:color w:val="888888"/>
+          <w:sz w:val="18"/>
+        </w:rPr>
+        <w:t xml:space="preserve">    2023</w:t>
+      </w:r>
+    </w:p>
+    <w:p>
+      <w:r>
+        <w:rPr>
+          <w:b/>
+          <w:color w:val="1A4A9E"/>
+          <w:sz w:val="19"/>
+        </w:rPr>
+        <w:t>Montée en compétences &amp; projets personnels</w:t>
+      </w:r>
+    </w:p>
+    <w:p>
+      <w:pPr>
+        <w:pStyle w:val="ListBullet"/>
+        <w:spacing w:after="0" w:before="0"/>
+      </w:pPr>
+      <w:r>
+        <w:rPr>
+          <w:sz w:val="18"/>
+        </w:rPr>
+        <w:t>Exploré 7 pays (Honduras, Colombie, Mexique, Guatemala, Nicaragua, Costa Rica, Panama).</w:t>
+      </w:r>
+    </w:p>
+    <w:p>
+      <w:pPr>
+        <w:pStyle w:val="ListBullet"/>
+        <w:spacing w:after="0" w:before="0"/>
+      </w:pPr>
+      <w:r>
+        <w:rPr>
+          <w:sz w:val="18"/>
+        </w:rPr>
+        <w:t>Création d'assistant IA agentique et pipelines QA automatisés (Python, LLMs, GitHub Actions).</w:t>
+      </w:r>
+    </w:p>
+    <w:p>
+      <w:pPr>
+        <w:pStyle w:val="ListBullet"/>
+        <w:spacing w:after="0" w:before="0"/>
+      </w:pPr>
+      <w:r>
+        <w:rPr>
+          <w:sz w:val="18"/>
+        </w:rPr>
+        <w:t>Développement d'une plateforme d'agrégation de news IA temps réel (Next.js, Supabase, OpenAI, 86 flux RSS).</w:t>
+      </w:r>
+    </w:p>
+    <w:p>
+      <w:pPr>
+        <w:spacing w:after="80"/>
+      </w:pPr>
+      <w:r>
+        <w:rPr>
+          <w:color w:val="888888"/>
+          <w:sz w:val="17"/>
+        </w:rPr>
+        <w:t>Environnement : Python, Next.js, Supabase, LLMs, GitHub Actions, OpenAI</w:t>
+      </w:r>
+    </w:p>
+    <w:p>
+      <w:pPr>
+        <w:spacing w:before="160" w:after="80"/>
+      </w:pPr>
+      <w:r>
+        <w:rPr>
+          <w:b/>
+          <w:color w:val="1A2744"/>
+          <w:sz w:val="24"/>
+          <w:u w:val="single"/>
+        </w:rPr>
+        <w:t>Formations</w:t>
+      </w:r>
+    </w:p>
+    <w:p>
+      <w:r>
+        <w:rPr>
+          <w:b/>
+          <w:color w:val="111111"/>
+          <w:sz w:val="19"/>
+        </w:rPr>
+        <w:t>Master Management de Projet — Génie Logiciel</w:t>
+      </w:r>
+      <w:r>
+        <w:rPr>
+          <w:b w:val="0"/>
+          <w:color w:val="666666"/>
+          <w:sz w:val="18"/>
+        </w:rPr>
+        <w:t xml:space="preserve"> — Université Paris Nanterre</w:t>
+      </w:r>
+      <w:r>
+        <w:rPr>
+          <w:b w:val="0"/>
+          <w:color w:val="888888"/>
+          <w:sz w:val="18"/>
+        </w:rPr>
+        <w:t xml:space="preserve"> (2009-2011)</w:t>
+      </w:r>
+    </w:p>
+    <w:p>
+      <w:r>
+        <w:rPr>
+          <w:b/>
+          <w:color w:val="111111"/>
+          <w:sz w:val="19"/>
+        </w:rPr>
+        <w:t>Licence Informatique</w:t>
+      </w:r>
+      <w:r>
+        <w:rPr>
+          <w:b w:val="0"/>
+          <w:color w:val="666666"/>
+          <w:sz w:val="18"/>
+        </w:rPr>
+        <w:t xml:space="preserve"> — Université Paris Nanterre</w:t>
+      </w:r>
+      <w:r>
+        <w:rPr>
+          <w:b w:val="0"/>
+          <w:color w:val="888888"/>
+          <w:sz w:val="18"/>
+        </w:rPr>
+        <w:t xml:space="preserve"> (2006-2009)</w:t>
+      </w:r>
+    </w:p>
+    <w:p>
+      <w:pPr>
+        <w:spacing w:before="160" w:after="80"/>
+      </w:pPr>
+      <w:r>
+        <w:rPr>
+          <w:b/>
+          <w:color w:val="1A2744"/>
+          <w:sz w:val="24"/>
+          <w:u w:val="single"/>
+        </w:rPr>
+        <w:t>Langues</w:t>
+      </w:r>
+    </w:p>
+    <w:p>
+      <w:r>
+        <w:rPr>
+          <w:b w:val="0"/>
+          <w:sz w:val="19"/>
+        </w:rPr>
+        <w:t>Français</w:t>
+      </w:r>
+      <w:r>
+        <w:rPr>
+          <w:color w:val="888888"/>
+          <w:sz w:val="18"/>
+        </w:rPr>
+        <w:t xml:space="preserve"> — natif</w:t>
+      </w:r>
+      <w:r>
+        <w:rPr>
+          <w:sz w:val="18"/>
+        </w:rPr>
+        <w:t xml:space="preserve">  •  </w:t>
+      </w:r>
+      <w:r>
+        <w:rPr>
+          <w:b/>
+          <w:sz w:val="19"/>
+        </w:rPr>
+        <w:t>Anglais</w:t>
+      </w:r>
+      <w:r>
+        <w:rPr>
+          <w:color w:val="888888"/>
+          <w:sz w:val="18"/>
+        </w:rPr>
+        <w:t xml:space="preserve"> — courant (C1/C2)</w:t>
+      </w:r>
+      <w:r>
+        <w:rPr>
+          <w:sz w:val="18"/>
+        </w:rPr>
+        <w:t xml:space="preserve">  •  </w:t>
+      </w:r>
+      <w:r>
+        <w:rPr>
+          <w:b w:val="0"/>
+          <w:sz w:val="19"/>
+        </w:rPr>
+        <w:t>Espagnol</w:t>
+      </w:r>
+      <w:r>
+        <w:rPr>
+          <w:color w:val="888888"/>
+          <w:sz w:val="18"/>
+        </w:rPr>
+        <w:t xml:space="preserve"> — professionnel</w:t>
+      </w:r>
+      <w:r>
+        <w:rPr>
+          <w:sz w:val="18"/>
+        </w:rPr>
+        <w:t xml:space="preserve">  •  </w:t>
+      </w:r>
+      <w:r>
+        <w:rPr>
+          <w:b w:val="0"/>
+          <w:sz w:val="19"/>
+        </w:rPr>
+        <w:t>Bengali</w:t>
+      </w:r>
+      <w:r>
+        <w:rPr>
+          <w:color w:val="888888"/>
+          <w:sz w:val="18"/>
+        </w:rPr>
+        <w:t xml:space="preserve"> — courant</w:t>
       </w:r>
     </w:p>
     <w:sectPr>
-      <w:pgSz w:w="12240" w:h="15840"/>
-      <w:pgMar w:top="1440" w:right="1800" w:bottom="1440" w:left="1800" w:header="720" w:footer="720" w:gutter="0"/>
+      <w:pgSz w:w="11906" w:h="16838"/>
+      <w:pgMar w:top="850" w:right="1020" w:bottom="680" w:left="1020" w:header="720" w:footer="720" w:gutter="0"/>
       <w:cols w:space="720"/>
       <w:docGrid w:linePitch="360"/>
     </w:sectPr>
@@ -385,6 +1314,10 @@
     <w:name w:val="Normal"/>
     <w:qFormat/>
     <w:rsid w:val="00FC693F"/>
+    <w:rPr>
+      <w:rFonts w:ascii="Calibri" w:hAnsi="Calibri"/>
+      <w:sz w:val="20"/>
+    </w:rPr>
   </w:style>
   <w:style w:type="paragraph" w:styleId="Header">
     <w:name w:val="header"/>

</xml_diff>